<commit_message>
Revise SKPL to production use cases only, remove data dummy UC
</commit_message>
<xml_diff>
--- a/Update_SKPL_PrakCheck.docx
+++ b/Update_SKPL_PrakCheck.docx
@@ -1,6 +1,6 @@
 
 <file path=word/document.xml><?xml version="1.0" encoding="UTF-8" standalone="yes"?>
-<w:document xmlns:ve="http://schemas.openxmlformats.org/markup-compatibility/2006" xmlns:o="urn:schemas-microsoft-com:office:office" xmlns:r="http://schemas.openxmlformats.org/officeDocument/2006/relationships" xmlns:m="http://schemas.openxmlformats.org/officeDocument/2006/math" xmlns:v="urn:schemas-microsoft-com:vml" xmlns:wp="http://schemas.openxmlformats.org/drawingml/2006/wordprocessingDrawing" xmlns:w10="urn:schemas-microsoft-com:office:word" xmlns:w="http://schemas.openxmlformats.org/wordprocessingml/2006/main" xmlns:wne="http://schemas.microsoft.com/office/word/2006/wordml"><w:body><w:p><w:pPr><w:pStyle w:val="Heading1"/></w:pPr><w:r><w:rPr/><w:t xml:space="preserve">DRAFT UPDATE SKPL (Spesifikasi Kebutuhan Perangkat Lunak) PrakCheck</w:t></w:r></w:p><w:p/><w:p><w:pPr/><w:r><w:rPr><w:i w:val="1"/><w:iCs w:val="1"/></w:rPr><w:t xml:space="preserve">Dokumen ini adalah rancangan sementara untuk menyelaraskan SKPL lama dengan fitur aktual (100% by code) yang telah terimplementasi di PrakCheck.</w:t></w:r></w:p><w:p/><w:p/><w:p><w:pPr><w:pStyle w:val="Heading2"/></w:pPr><w:r><w:rPr/><w:t xml:space="preserve">1. Pembaruan Deskripsi Umum Sistem</w:t></w:r></w:p><w:p/><w:p><w:pPr/><w:r><w:rPr/><w:t xml:space="preserve">PrakCheck bukan sekadar sistem pengumpulan tugas biasa, melainkan platform </w:t></w:r></w:p><w:p><w:pPr/><w:r><w:rPr><w:b w:val="1"/><w:bCs w:val="1"/></w:rPr><w:t xml:space="preserve">Learning Management System (LMS) khusus praktikum</w:t></w:r></w:p><w:p><w:pPr/><w:r><w:rPr/><w:t xml:space="preserve"> yang dirancang dengan kapabilitas </w:t></w:r></w:p><w:p><w:pPr/><w:r><w:rPr><w:i w:val="1"/><w:iCs w:val="1"/></w:rPr><w:t xml:space="preserve">In-Browser Preview</w:t></w:r></w:p><w:p><w:pPr/><w:r><w:rPr/><w:t xml:space="preserve"> untuk mempercepat proses koreksi oleh asisten, serta dilengkapi dengan sistem cerdas pendeteksi kemiripan (plagiarisme) antar pengumpulan tugas mahasiswa.</w:t></w:r></w:p><w:p/><w:p/><w:p><w:pPr><w:pStyle w:val="Heading2"/></w:pPr><w:r><w:rPr/><w:t xml:space="preserve">2. Pembaruan Aktor (User Roles)</w:t></w:r></w:p><w:p/><w:p><w:pPr><w:numPr><w:ilvl w:val="0"/><w:numId w:val="1"/></w:numPr></w:pPr><w:r><w:rPr><w:b w:val="1"/><w:bCs w:val="1"/></w:rPr><w:t xml:space="preserve">Asisten Praktikum (Asprak):</w:t></w:r><w:r><w:rPr/><w:t xml:space="preserve"> Bertindak sebagai pengajar utama di dalam sistem. Memiliki kendali penuh atas kelas, pengumuman, modul tugas, koreksi, dan verifikasi plagiarisme.</w:t></w:r></w:p><w:p/><w:p><w:pPr><w:numPr><w:ilvl w:val="0"/><w:numId w:val="1"/></w:numPr></w:pPr><w:r><w:rPr><w:b w:val="1"/><w:bCs w:val="1"/></w:rPr><w:t xml:space="preserve">Mahasiswa:</w:t></w:r><w:r><w:rPr/><w:t xml:space="preserve"> Aktor pasif-aktif yang tergabung dalam kelas berdasarkan aspek/golongan, menerima pengumuman, dan mengunggah tugas sesuai tenggat waktu.</w:t></w:r></w:p><w:p/><w:p/><w:p><w:pPr><w:pStyle w:val="Heading2"/></w:pPr><w:r><w:rPr/><w:t xml:space="preserve">3. Daftar Use Case (100% Akurat dengan Kode Saat Ini)</w:t></w:r></w:p><w:p/><w:p/><w:p><w:pPr><w:pStyle w:val="Heading3"/></w:pPr><w:r><w:rPr/><w:t xml:space="preserve">UC-01: Instalasi & Pembuatan Skenario Data (One-Click Installer)</w:t></w:r></w:p><w:p/><w:p><w:pPr><w:numPr><w:ilvl w:val="0"/><w:numId w:val="1"/></w:numPr></w:pPr><w:r><w:rPr><w:b w:val="1"/><w:bCs w:val="1"/></w:rPr><w:t xml:space="preserve">Aktor:</w:t></w:r><w:r><w:rPr/><w:t xml:space="preserve"> Administrator / Asisten</w:t></w:r></w:p><w:p/><w:p><w:pPr><w:numPr><w:ilvl w:val="0"/><w:numId w:val="1"/></w:numPr></w:pPr><w:r><w:rPr><w:b w:val="1"/><w:bCs w:val="1"/></w:rPr><w:t xml:space="preserve">Deskripsi:</w:t></w:r><w:r><w:rPr/><w:t xml:space="preserve"> Menjalankan </w:t></w:r><w:r><w:rPr/><w:t xml:space="preserve">install_setup.php</w:t></w:r><w:r><w:rPr/><w:t xml:space="preserve"> untuk memformat ulang database (</w:t></w:r><w:r><w:rPr/><w:t xml:space="preserve">install.sql</w:t></w:r><w:r><w:rPr/><w:t xml:space="preserve">) dan secara otomatis membibitkan (seed) skenario pengujian komprehensif menggunakan </w:t></w:r><w:r><w:rPr/><w:t xml:space="preserve">add_data_dummy_2.php</w:t></w:r><w:r><w:rPr/><w:t xml:space="preserve">.</w:t></w:r></w:p><w:p/><w:p><w:pPr><w:numPr><w:ilvl w:val="0"/><w:numId w:val="1"/></w:numPr></w:pPr><w:r><w:rPr><w:b w:val="1"/><w:bCs w:val="1"/></w:rPr><w:t xml:space="preserve">Kondisi Akhir:</w:t></w:r><w:r><w:rPr/><w:t xml:space="preserve"> Tercipta 10 akun Asprak, 50 akun Mahasiswa, 40 modul tugas, dan 300+ pengumpulan tugas dengan 5 profil behavior mahasiswa yang bervariasi (aktif, telat, plagiat, dsb). Mahasiswa secara otomatis tergabung ke tabel </w:t></w:r><w:r><w:rPr/><w:t xml:space="preserve">class_members</w:t></w:r><w:r><w:rPr/><w:t xml:space="preserve">.</w:t></w:r></w:p><w:p/><w:p/><w:p><w:pPr><w:pStyle w:val="Heading3"/></w:pPr><w:r><w:rPr/><w:t xml:space="preserve">UC-02: Autentikasi & Keamanan Akun</w:t></w:r></w:p><w:p/><w:p><w:pPr><w:numPr><w:ilvl w:val="0"/><w:numId w:val="1"/></w:numPr></w:pPr><w:r><w:rPr><w:b w:val="1"/><w:bCs w:val="1"/></w:rPr><w:t xml:space="preserve">Aktor:</w:t></w:r><w:r><w:rPr/><w:t xml:space="preserve"> Semua</w:t></w:r></w:p><w:p/><w:p><w:pPr><w:numPr><w:ilvl w:val="0"/><w:numId w:val="1"/></w:numPr></w:pPr><w:r><w:rPr><w:b w:val="1"/><w:bCs w:val="1"/></w:rPr><w:t xml:space="preserve">Deskripsi:</w:t></w:r><w:r><w:rPr/><w:t xml:space="preserve"> Login dengan proteksi </w:t></w:r><w:r><w:rPr><w:i w:val="1"/><w:iCs w:val="1"/></w:rPr><w:t xml:space="preserve">password_hash</w:t></w:r><w:r><w:rPr/><w:t xml:space="preserve"> standar industri. Termasuk fitur "Lupa Password" yang memicu pengiriman token OTP/Link via Brevo SMTP Integration (</w:t></w:r><w:r><w:rPr/><w:t xml:space="preserve">config_mail.php</w:t></w:r><w:r><w:rPr/><w:t xml:space="preserve">).</w:t></w:r></w:p><w:p/><w:p/><w:p><w:pPr><w:pStyle w:val="Heading3"/></w:pPr><w:r><w:rPr/><w:t xml:space="preserve">UC-03: Manajemen Kelas & Pengumuman</w:t></w:r></w:p><w:p/><w:p><w:pPr><w:numPr><w:ilvl w:val="0"/><w:numId w:val="1"/></w:numPr></w:pPr><w:r><w:rPr><w:b w:val="1"/><w:bCs w:val="1"/></w:rPr><w:t xml:space="preserve">Aktor:</w:t></w:r><w:r><w:rPr/><w:t xml:space="preserve"> Asprak</w:t></w:r></w:p><w:p/><w:p><w:pPr><w:numPr><w:ilvl w:val="0"/><w:numId w:val="1"/></w:numPr></w:pPr><w:r><w:rPr><w:b w:val="1"/><w:bCs w:val="1"/></w:rPr><w:t xml:space="preserve">Deskripsi:</w:t></w:r><w:r><w:rPr/><w:t xml:space="preserve"> Pembuatan kelas (men-generate kode akses), mengelola anggota kelas, dan menyiarkan pengumuman dengan kemampuan untuk melampirkan file </w:t></w:r><w:r><w:rPr><w:i w:val="1"/><w:iCs w:val="1"/></w:rPr><w:t xml:space="preserve">attachment</w:t></w:r><w:r><w:rPr/><w:t xml:space="preserve"> pendukung.</w:t></w:r></w:p><w:p/><w:p/><w:p><w:pPr><w:pStyle w:val="Heading3"/></w:pPr><w:r><w:rPr/><w:t xml:space="preserve">UC-04: Manajemen Modul Tugas (Assignment)</w:t></w:r></w:p><w:p/><w:p><w:pPr><w:numPr><w:ilvl w:val="0"/><w:numId w:val="1"/></w:numPr></w:pPr><w:r><w:rPr><w:b w:val="1"/><w:bCs w:val="1"/></w:rPr><w:t xml:space="preserve">Aktor:</w:t></w:r><w:r><w:rPr/><w:t xml:space="preserve"> Asprak</w:t></w:r></w:p><w:p/><w:p><w:pPr><w:numPr><w:ilvl w:val="0"/><w:numId w:val="1"/></w:numPr></w:pPr><w:r><w:rPr><w:b w:val="1"/><w:bCs w:val="1"/></w:rPr><w:t xml:space="preserve">Deskripsi:</w:t></w:r><w:r><w:rPr/><w:t xml:space="preserve"> Membuat instruksi tugas dengan 3 opsi tipe tenggat waktu:</w:t></w:r></w:p><w:p/><w:p><w:pPr/><w:r><w:rPr/><w:t xml:space="preserve">  1. </w:t></w:r></w:p><w:p><w:pPr/><w:r><w:rPr><w:i w:val="1"/><w:iCs w:val="1"/></w:rPr><w:t xml:space="preserve">No Deadline</w:t></w:r></w:p><w:p><w:pPr/><w:r><w:rPr/><w:t xml:space="preserve"> (bebas kapan saja).</w:t></w:r></w:p><w:p/><w:p><w:pPr/><w:r><w:rPr/><w:t xml:space="preserve">  2. </w:t></w:r></w:p><w:p><w:pPr/><w:r><w:rPr><w:i w:val="1"/><w:iCs w:val="1"/></w:rPr><w:t xml:space="preserve">Soft Deadline</w:t></w:r></w:p><w:p><w:pPr/><w:r><w:rPr/><w:t xml:space="preserve"> (Menerima keterlambatan/late submission dengan penanda).</w:t></w:r></w:p><w:p/><w:p><w:pPr/><w:r><w:rPr/><w:t xml:space="preserve">  3. </w:t></w:r></w:p><w:p><w:pPr/><w:r><w:rPr><w:i w:val="1"/><w:iCs w:val="1"/></w:rPr><w:t xml:space="preserve">Strict Deadline</w:t></w:r></w:p><w:p><w:pPr/><w:r><w:rPr/><w:t xml:space="preserve"> (Sistem mengunci pengunggahan secara otomatis).</w:t></w:r></w:p><w:p/><w:p><w:pPr><w:numPr><w:ilvl w:val="0"/><w:numId w:val="1"/></w:numPr></w:pPr><w:r><w:rPr><w:b w:val="1"/><w:bCs w:val="1"/></w:rPr><w:t xml:space="preserve">Aturan File:</w:t></w:r><w:r><w:rPr/><w:t xml:space="preserve"> Asprak dapat membatasi ekstensi file yang diizinkan (.pdf, .docx, .zip) serta jumlah maksimum file (hingga 5 file per tugas).</w:t></w:r></w:p><w:p/><w:p/><w:p><w:pPr><w:pStyle w:val="Heading3"/></w:pPr><w:r><w:rPr/><w:t xml:space="preserve">UC-05: Pengumpulan Tugas (Submission)</w:t></w:r></w:p><w:p/><w:p><w:pPr><w:numPr><w:ilvl w:val="0"/><w:numId w:val="1"/></w:numPr></w:pPr><w:r><w:rPr><w:b w:val="1"/><w:bCs w:val="1"/></w:rPr><w:t xml:space="preserve">Aktor:</w:t></w:r><w:r><w:rPr/><w:t xml:space="preserve"> Mahasiswa</w:t></w:r></w:p><w:p/><w:p><w:pPr><w:numPr><w:ilvl w:val="0"/><w:numId w:val="1"/></w:numPr></w:pPr><w:r><w:rPr><w:b w:val="1"/><w:bCs w:val="1"/></w:rPr><w:t xml:space="preserve">Deskripsi:</w:t></w:r><w:r><w:rPr/><w:t xml:space="preserve"> Mengunggah file tugas menggunakan antarmuka </w:t></w:r><w:r><w:rPr><w:i w:val="1"/><w:iCs w:val="1"/></w:rPr><w:t xml:space="preserve">Drag & Drop</w:t></w:r><w:r><w:rPr/><w:t xml:space="preserve"> yang elegan. Menyimpan tugas sebagai </w:t></w:r><w:r><w:rPr><w:i w:val="1"/><w:iCs w:val="1"/></w:rPr><w:t xml:space="preserve">Draft</w:t></w:r><w:r><w:rPr/><w:t xml:space="preserve"> (belum dinilai) sebelum dilakukan </w:t></w:r><w:r><w:rPr><w:i w:val="1"/><w:iCs w:val="1"/></w:rPr><w:t xml:space="preserve">Final Submit</w:t></w:r><w:r><w:rPr/><w:t xml:space="preserve">. </w:t></w:r></w:p><w:p/><w:p/><w:p><w:pPr><w:pStyle w:val="Heading3"/></w:pPr><w:r><w:rPr/><w:t xml:space="preserve">UC-06: In-Browser File Preview Engine</w:t></w:r></w:p><w:p/><w:p><w:pPr><w:numPr><w:ilvl w:val="0"/><w:numId w:val="1"/></w:numPr></w:pPr><w:r><w:rPr><w:b w:val="1"/><w:bCs w:val="1"/></w:rPr><w:t xml:space="preserve">Aktor:</w:t></w:r><w:r><w:rPr/><w:t xml:space="preserve"> Asprak & Mahasiswa</w:t></w:r></w:p><w:p/><w:p><w:pPr><w:numPr><w:ilvl w:val="0"/><w:numId w:val="1"/></w:numPr></w:pPr><w:r><w:rPr><w:b w:val="1"/><w:bCs w:val="1"/></w:rPr><w:t xml:space="preserve">Deskripsi:</w:t></w:r><w:r><w:rPr/><w:t xml:space="preserve"> Melihat secara langsung isi file yang diunggah tanpa harus men-download. Format yang didukung (100% tervalidasi di </w:t></w:r><w:r><w:rPr/><w:t xml:space="preserve">assets/js/preview.js</w:t></w:r><w:r><w:rPr/><w:t xml:space="preserve"> & </w:t></w:r><w:r><w:rPr/><w:t xml:space="preserve">serve_file.php</w:t></w:r><w:r><w:rPr/><w:t xml:space="preserve">):</w:t></w:r></w:p><w:p/><w:p><w:pPr/><w:r><w:rPr/><w:t xml:space="preserve">  - </w:t></w:r></w:p><w:p><w:pPr/><w:r><w:rPr><w:b w:val="1"/><w:bCs w:val="1"/></w:rPr><w:t xml:space="preserve">Dokumen:</w:t></w:r></w:p><w:p><w:pPr/><w:r><w:rPr/><w:t xml:space="preserve"> </w:t></w:r></w:p><w:p><w:pPr/><w:r><w:rPr/><w:t xml:space="preserve">.pdf</w:t></w:r></w:p><w:p><w:pPr/><w:r><w:rPr/><w:t xml:space="preserve"> (via PDF.js) dan </w:t></w:r></w:p><w:p><w:pPr/><w:r><w:rPr/><w:t xml:space="preserve">.docx</w:t></w:r></w:p><w:p><w:pPr/><w:r><w:rPr/><w:t xml:space="preserve"> / </w:t></w:r></w:p><w:p><w:pPr/><w:r><w:rPr/><w:t xml:space="preserve">.doc</w:t></w:r></w:p><w:p><w:pPr/><w:r><w:rPr/><w:t xml:space="preserve"> (via Mammoth.js secara lokal tanpa server Microsoft).</w:t></w:r></w:p><w:p/><w:p><w:pPr/><w:r><w:rPr/><w:t xml:space="preserve">  - </w:t></w:r></w:p><w:p><w:pPr/><w:r><w:rPr><w:b w:val="1"/><w:bCs w:val="1"/></w:rPr><w:t xml:space="preserve">Multimedia:</w:t></w:r></w:p><w:p><w:pPr/><w:r><w:rPr/><w:t xml:space="preserve"> Gambar (</w:t></w:r></w:p><w:p><w:pPr/><w:r><w:rPr/><w:t xml:space="preserve">.jpg</w:t></w:r></w:p><w:p><w:pPr/><w:r><w:rPr/><w:t xml:space="preserve">, </w:t></w:r></w:p><w:p><w:pPr/><w:r><w:rPr/><w:t xml:space="preserve">.png</w:t></w:r></w:p><w:p><w:pPr/><w:r><w:rPr/><w:t xml:space="preserve">, </w:t></w:r></w:p><w:p><w:pPr/><w:r><w:rPr/><w:t xml:space="preserve">.webp</w:t></w:r></w:p><w:p><w:pPr/><w:r><w:rPr/><w:t xml:space="preserve">) dan Video (</w:t></w:r></w:p><w:p><w:pPr/><w:r><w:rPr/><w:t xml:space="preserve">.mp4</w:t></w:r></w:p><w:p><w:pPr/><w:r><w:rPr/><w:t xml:space="preserve">, </w:t></w:r></w:p><w:p><w:pPr/><w:r><w:rPr/><w:t xml:space="preserve">.webm</w:t></w:r></w:p><w:p><w:pPr/><w:r><w:rPr/><w:t xml:space="preserve">).</w:t></w:r></w:p><w:p/><w:p><w:pPr/><w:r><w:rPr/><w:t xml:space="preserve">  - </w:t></w:r></w:p><w:p><w:pPr/><w:r><w:rPr><w:b w:val="1"/><w:bCs w:val="1"/></w:rPr><w:t xml:space="preserve">Source Code / Teks:</w:t></w:r></w:p><w:p><w:pPr/><w:r><w:rPr/><w:t xml:space="preserve"> </w:t></w:r></w:p><w:p><w:pPr/><w:r><w:rPr/><w:t xml:space="preserve">.txt</w:t></w:r></w:p><w:p><w:pPr/><w:r><w:rPr/><w:t xml:space="preserve">, </w:t></w:r></w:p><w:p><w:pPr/><w:r><w:rPr/><w:t xml:space="preserve">.php</w:t></w:r></w:p><w:p><w:pPr/><w:r><w:rPr/><w:t xml:space="preserve">, </w:t></w:r></w:p><w:p><w:pPr/><w:r><w:rPr/><w:t xml:space="preserve">.sql</w:t></w:r></w:p><w:p><w:pPr/><w:r><w:rPr/><w:t xml:space="preserve">, </w:t></w:r></w:p><w:p><w:pPr/><w:r><w:rPr/><w:t xml:space="preserve">.js</w:t></w:r></w:p><w:p><w:pPr/><w:r><w:rPr/><w:t xml:space="preserve">, </w:t></w:r></w:p><w:p><w:pPr/><w:r><w:rPr/><w:t xml:space="preserve">.css</w:t></w:r></w:p><w:p><w:pPr/><w:r><w:rPr/><w:t xml:space="preserve">, </w:t></w:r></w:p><w:p><w:pPr/><w:r><w:rPr/><w:t xml:space="preserve">.json</w:t></w:r></w:p><w:p><w:pPr/><w:r><w:rPr/><w:t xml:space="preserve">, </w:t></w:r></w:p><w:p><w:pPr/><w:r><w:rPr/><w:t xml:space="preserve">.md</w:t></w:r></w:p><w:p><w:pPr/><w:r><w:rPr/><w:t xml:space="preserve"> (di-render rapi pada </w:t></w:r></w:p><w:p><w:pPr/><w:r><w:rPr><w:i w:val="1"/><w:iCs w:val="1"/></w:rPr><w:t xml:space="preserve">monokai code block</w:t></w:r></w:p><w:p><w:pPr/><w:r><w:rPr/><w:t xml:space="preserve"> lengkap dengan proteksi </w:t></w:r></w:p><w:p><w:pPr/><w:r><w:rPr><w:i w:val="1"/><w:iCs w:val="1"/></w:rPr><w:t xml:space="preserve">escape XSS</w:t></w:r></w:p><w:p><w:pPr/><w:r><w:rPr/><w:t xml:space="preserve">).</w:t></w:r></w:p><w:p/><w:p/><w:p><w:pPr><w:pStyle w:val="Heading3"/></w:pPr><w:r><w:rPr/><w:t xml:space="preserve">UC-07: Deteksi Kemiripan & Plagiarisme Lintas Dokumen</w:t></w:r></w:p><w:p/><w:p><w:pPr><w:numPr><w:ilvl w:val="0"/><w:numId w:val="1"/></w:numPr></w:pPr><w:r><w:rPr><w:b w:val="1"/><w:bCs w:val="1"/></w:rPr><w:t xml:space="preserve">Aktor:</w:t></w:r><w:r><w:rPr/><w:t xml:space="preserve"> Asprak</w:t></w:r></w:p><w:p/><w:p><w:pPr><w:numPr><w:ilvl w:val="0"/><w:numId w:val="1"/></w:numPr></w:pPr><w:r><w:rPr><w:b w:val="1"/><w:bCs w:val="1"/></w:rPr><w:t xml:space="preserve">Deskripsi:</w:t></w:r><w:r><w:rPr/><w:t xml:space="preserve"> Mengeksekusi modul </w:t></w:r><w:r><w:rPr/><w:t xml:space="preserve">check_plagiarism.php</w:t></w:r><w:r><w:rPr/><w:t xml:space="preserve"> untuk membandingkan satu file tugas (.pdf / .docx) mahasiswa terhadap </w:t></w:r><w:r><w:rPr><w:i w:val="1"/><w:iCs w:val="1"/></w:rPr><w:t xml:space="preserve">seluruh</w:t></w:r><w:r><w:rPr/><w:t xml:space="preserve"> file mahasiswa lain dalam satu modul tugas (satu </w:t></w:r><w:r><w:rPr><w:i w:val="1"/><w:iCs w:val="1"/></w:rPr><w:t xml:space="preserve">assignment_id</w:t></w:r><w:r><w:rPr/><w:t xml:space="preserve">).</w:t></w:r></w:p><w:p/><w:p><w:pPr><w:numPr><w:ilvl w:val="0"/><w:numId w:val="1"/></w:numPr></w:pPr><w:r><w:rPr><w:b w:val="1"/><w:bCs w:val="1"/></w:rPr><w:t xml:space="preserve">Proses:</w:t></w:r><w:r><w:rPr/><w:t xml:space="preserve"> Sistem mengekstraksi teks dokumen, mengubahnya menjadi </w:t></w:r><w:r><w:rPr><w:i w:val="1"/><w:iCs w:val="1"/></w:rPr><w:t xml:space="preserve">n-gram/trigram</w:t></w:r><w:r><w:rPr/><w:t xml:space="preserve">, dan menghitung persentase kemiripan </w:t></w:r><w:r><w:rPr><w:i w:val="1"/><w:iCs w:val="1"/></w:rPr><w:t xml:space="preserve">Intersection over Union</w:t></w:r><w:r><w:rPr/><w:t xml:space="preserve">.</w:t></w:r></w:p><w:p/><w:p><w:pPr><w:numPr><w:ilvl w:val="0"/><w:numId w:val="1"/></w:numPr></w:pPr><w:r><w:rPr><w:b w:val="1"/><w:bCs w:val="1"/></w:rPr><w:t xml:space="preserve">Aksi Penalti:</w:t></w:r><w:r><w:rPr/><w:t xml:space="preserve"> Asisten dapat mengaplikasikan denda nilai (</w:t></w:r><w:r><w:rPr><w:i w:val="1"/><w:iCs w:val="1"/></w:rPr><w:t xml:space="preserve">plagiarism penalty</w:t></w:r><w:r><w:rPr/><w:t xml:space="preserve">) secara terpisah dari </w:t></w:r><w:r><w:rPr><w:i w:val="1"/><w:iCs w:val="1"/></w:rPr><w:t xml:space="preserve">grade</w:t></w:r><w:r><w:rPr/><w:t xml:space="preserve"> murni (Nilai Akhir = Grade - Penalty).</w:t></w:r></w:p><w:p/><w:p/><w:p><w:pPr><w:pStyle w:val="Heading3"/></w:pPr><w:r><w:rPr/><w:t xml:space="preserve">UC-08: Penilaian (Grading) & Rekapitulasi Ekspor</w:t></w:r></w:p><w:p/><w:p><w:pPr><w:numPr><w:ilvl w:val="0"/><w:numId w:val="1"/></w:numPr></w:pPr><w:r><w:rPr><w:b w:val="1"/><w:bCs w:val="1"/></w:rPr><w:t xml:space="preserve">Aktor:</w:t></w:r><w:r><w:rPr/><w:t xml:space="preserve"> Asprak</w:t></w:r></w:p><w:p/><w:p><w:pPr><w:numPr><w:ilvl w:val="0"/><w:numId w:val="1"/></w:numPr></w:pPr><w:r><w:rPr><w:b w:val="1"/><w:bCs w:val="1"/></w:rPr><w:t xml:space="preserve">Deskripsi:</w:t></w:r><w:r><w:rPr/><w:t xml:space="preserve"> Memberikan nilai akhir (maks 100) dan </w:t></w:r><w:r><w:rPr><w:i w:val="1"/><w:iCs w:val="1"/></w:rPr><w:t xml:space="preserve">feedback</w:t></w:r><w:r><w:rPr/><w:t xml:space="preserve"> naratif. Mampu mengekspor rekapan nilai seluruh kelas menjadi file CSV (</w:t></w:r><w:r><w:rPr/><w:t xml:space="preserve">export_grades.php</w:t></w:r><w:r><w:rPr/><w:t xml:space="preserve">), di mana perhitungan akumulasi (bobot persentase) diproses secara adil tanpa mengikutsertakan kebocoran </w:t></w:r><w:r><w:rPr><w:i w:val="1"/><w:iCs w:val="1"/></w:rPr><w:t xml:space="preserve">denominator</w:t></w:r><w:r><w:rPr/><w:t xml:space="preserve"> pada mahasiswa yang tidak mengumpulkan tugas.</w:t></w:r></w:p><w:p/><w:p/><w:p><w:pPr><w:pStyle w:val="Heading3"/></w:pPr><w:r><w:rPr/><w:t xml:space="preserve">UC-09: Pendaftaran Kelas Mandiri (Self-Enrollment)</w:t></w:r></w:p><w:p/><w:p><w:pPr><w:numPr><w:ilvl w:val="0"/><w:numId w:val="1"/></w:numPr></w:pPr><w:r><w:rPr><w:b w:val="1"/><w:bCs w:val="1"/></w:rPr><w:t xml:space="preserve">Aktor:</w:t></w:r><w:r><w:rPr/><w:t xml:space="preserve"> Mahasiswa</w:t></w:r></w:p><w:p/><w:p><w:pPr><w:numPr><w:ilvl w:val="0"/><w:numId w:val="1"/></w:numPr></w:pPr><w:r><w:rPr><w:b w:val="1"/><w:bCs w:val="1"/></w:rPr><w:t xml:space="preserve">Deskripsi:</w:t></w:r><w:r><w:rPr/><w:t xml:space="preserve"> Mahasiswa dapat bergabung ke dalam kelas secara mandiri melalui menu </w:t></w:r><w:r><w:rPr/><w:t xml:space="preserve">Join Class</w:t></w:r><w:r><w:rPr/><w:t xml:space="preserve"> dengan memasukkan Kode Kelas (</w:t></w:r><w:r><w:rPr><w:i w:val="1"/><w:iCs w:val="1"/></w:rPr><w:t xml:space="preserve">Class Code</w:t></w:r><w:r><w:rPr/><w:t xml:space="preserve">) unik (berisi 8 karakter alfanumerik) yang dibagikan oleh Asisten.</w:t></w:r></w:p><w:p/><w:p/><w:p><w:pPr><w:pStyle w:val="Heading3"/></w:pPr><w:r><w:rPr/><w:t xml:space="preserve">UC-10: Rotasi Kode Rahasia Asisten (UI Security Management)</w:t></w:r></w:p><w:p/><w:p><w:pPr><w:numPr><w:ilvl w:val="0"/><w:numId w:val="1"/></w:numPr></w:pPr><w:r><w:rPr><w:b w:val="1"/><w:bCs w:val="1"/></w:rPr><w:t xml:space="preserve">Aktor:</w:t></w:r><w:r><w:rPr/><w:t xml:space="preserve"> Asprak</w:t></w:r></w:p><w:p/><w:p><w:pPr><w:numPr><w:ilvl w:val="0"/><w:numId w:val="1"/></w:numPr></w:pPr><w:r><w:rPr><w:b w:val="1"/><w:bCs w:val="1"/></w:rPr><w:t xml:space="preserve">Deskripsi:</w:t></w:r><w:r><w:rPr/><w:t xml:space="preserve"> Asisten dapat secara mandiri memperbarui "Kode Rahasia Pendaftaran Asisten" langsung dari halaman Dashboard tanpa perlu menyentuh source code (</w:t></w:r><w:r><w:rPr/><w:t xml:space="preserve">config/secret.php</w:t></w:r><w:r><w:rPr/><w:t xml:space="preserve">). Ini digunakan sebagai pengamanan berlapis agar mahasiswa tidak bisa mendaftar sebagai asisten.</w:t></w:r></w:p><w:p/><w:p/><w:p><w:pPr><w:pStyle w:val="Heading3"/></w:pPr><w:r><w:rPr/><w:t xml:space="preserve">UC-11: Kategorisasi Mahasiswa via Aspek Penilaian</w:t></w:r></w:p><w:p/><w:p><w:pPr><w:numPr><w:ilvl w:val="0"/><w:numId w:val="1"/></w:numPr></w:pPr><w:r><w:rPr><w:b w:val="1"/><w:bCs w:val="1"/></w:rPr><w:t xml:space="preserve">Aktor:</w:t></w:r><w:r><w:rPr/><w:t xml:space="preserve"> Asprak</w:t></w:r></w:p><w:p/><w:p><w:pPr><w:numPr><w:ilvl w:val="0"/><w:numId w:val="1"/></w:numPr></w:pPr><w:r><w:rPr><w:b w:val="1"/><w:bCs w:val="1"/></w:rPr><w:t xml:space="preserve">Deskripsi:</w:t></w:r><w:r><w:rPr/><w:t xml:space="preserve"> Asisten dapat memecah mahasiswa di dalam satu kelas yang sama ke dalam beberapa "Aspek Penilaian" (</w:t></w:r><w:r><w:rPr><w:i w:val="1"/><w:iCs w:val="1"/></w:rPr><w:t xml:space="preserve">Assessment Aspects</w:t></w:r><w:r><w:rPr/><w:t xml:space="preserve">), memungkinkan pengelompokan koreksi yang lebih terstruktur.</w:t></w:r></w:p><w:p/><w:p/><w:p><w:pPr><w:pStyle w:val="Heading3"/></w:pPr><w:r><w:rPr/><w:t xml:space="preserve">UC-12: Manajemen File Tugas & Sistem Draft</w:t></w:r></w:p><w:p/><w:p><w:pPr><w:numPr><w:ilvl w:val="0"/><w:numId w:val="1"/></w:numPr></w:pPr><w:r><w:rPr><w:b w:val="1"/><w:bCs w:val="1"/></w:rPr><w:t xml:space="preserve">Aktor:</w:t></w:r><w:r><w:rPr/><w:t xml:space="preserve"> Mahasiswa</w:t></w:r></w:p><w:p/><w:p><w:pPr><w:numPr><w:ilvl w:val="0"/><w:numId w:val="1"/></w:numPr></w:pPr><w:r><w:rPr><w:b w:val="1"/><w:bCs w:val="1"/></w:rPr><w:t xml:space="preserve">Deskripsi:</w:t></w:r><w:r><w:rPr/><w:t xml:space="preserve"> Mahasiswa dapat mengunggah, melihat (</w:t></w:r><w:r><w:rPr><w:i w:val="1"/><w:iCs w:val="1"/></w:rPr><w:t xml:space="preserve">preview</w:t></w:r><w:r><w:rPr/><w:t xml:space="preserve">), dan menghapus file lampiran mereka secara bebas selama status pengumpulan masih berupa </w:t></w:r><w:r><w:rPr/><w:t xml:space="preserve">Draft</w:t></w:r><w:r><w:rPr/><w:t xml:space="preserve">. Ketika mahasiswa menekan tombol </w:t></w:r><w:r><w:rPr><w:i w:val="1"/><w:iCs w:val="1"/></w:rPr><w:t xml:space="preserve">Final Submit</w:t></w:r><w:r><w:rPr/><w:t xml:space="preserve">, status berubah menjadi </w:t></w:r><w:r><w:rPr/><w:t xml:space="preserve">Submitted</w:t></w:r><w:r><w:rPr/><w:t xml:space="preserve"> dan manipulasi file akan dikunci.</w:t></w:r></w:p><w:p/><w:p/><w:p><w:pPr/><w:r><w:rPr/><w:t xml:space="preserve">---</w:t></w:r></w:p><w:p/><w:p/><w:p><w:pPr><w:pStyle w:val="Heading2"/></w:pPr><w:r><w:rPr/><w:t xml:space="preserve">4. Pembaruan Logika Bisnis, Keamanan & Constraint Database</w:t></w:r></w:p><w:p/><w:p/><w:p><w:pPr><w:numPr><w:ilvl w:val="0"/><w:numId w:val="1"/></w:numPr></w:pPr><w:r><w:rPr><w:b w:val="1"/><w:bCs w:val="1"/></w:rPr><w:t xml:space="preserve">Proteksi Cross-Site Request Forgery (CSRF):</w:t></w:r></w:p><w:p/><w:p><w:pPr/><w:r><w:rPr/><w:t xml:space="preserve">   - Hampir seluruh </w:t></w:r></w:p><w:p><w:pPr/><w:r><w:rPr><w:i w:val="1"/><w:iCs w:val="1"/></w:rPr><w:t xml:space="preserve">form</w:t></w:r></w:p><w:p><w:pPr/><w:r><w:rPr/><w:t xml:space="preserve"> kritikal yang mengubah status (mengubah sandi rahasia, menghapus file, submit tugas akhir) dilindungi oleh </w:t></w:r></w:p><w:p><w:pPr/><w:r><w:rPr><w:i w:val="1"/><w:iCs w:val="1"/></w:rPr><w:t xml:space="preserve">CSRF Token</w:t></w:r></w:p><w:p><w:pPr/><w:r><w:rPr/><w:t xml:space="preserve"> dinamis yang digenerate di setiap sesi untuk mencegah serangan peretasan dari situs luar.</w:t></w:r></w:p><w:p/><w:p><w:pPr><w:numPr><w:ilvl w:val="0"/><w:numId w:val="1"/></w:numPr></w:pPr><w:r><w:rPr><w:b w:val="1"/><w:bCs w:val="1"/></w:rPr><w:t xml:space="preserve">Akses Data Ketat (Authorization):</w:t></w:r></w:p><w:p/><w:p><w:pPr/><w:r><w:rPr/><w:t xml:space="preserve">   - File hanya bisa dibuka (di-request via HTTP) jika yang meminta adalah </w:t></w:r></w:p><w:p><w:pPr/><w:r><w:rPr><w:b w:val="1"/><w:bCs w:val="1"/></w:rPr><w:t xml:space="preserve">Uploader asli (Mahasiswa tersebut)</w:t></w:r></w:p><w:p><w:pPr/><w:r><w:rPr/><w:t xml:space="preserve"> atau </w:t></w:r></w:p><w:p><w:pPr/><w:r><w:rPr><w:b w:val="1"/><w:bCs w:val="1"/></w:rPr><w:t xml:space="preserve">Asisten dari kelas yang menaungi file tersebut</w:t></w:r></w:p><w:p><w:pPr/><w:r><w:rPr/><w:t xml:space="preserve"> (dicek di </w:t></w:r></w:p><w:p><w:pPr/><w:r><w:rPr/><w:t xml:space="preserve">isClassAssistant</w:t></w:r></w:p><w:p><w:pPr/><w:r><w:rPr/><w:t xml:space="preserve"> & </w:t></w:r></w:p><w:p><w:pPr/><w:r><w:rPr/><w:t xml:space="preserve">isClassMember</w:t></w:r></w:p><w:p><w:pPr/><w:r><w:rPr/><w:t xml:space="preserve">).</w:t></w:r></w:p><w:p/><w:p><w:pPr><w:numPr><w:ilvl w:val="0"/><w:numId w:val="1"/></w:numPr></w:pPr><w:r><w:rPr><w:b w:val="1"/><w:bCs w:val="1"/></w:rPr><w:t xml:space="preserve">Sinkronisasi Waktu (Timezone Fix):</w:t></w:r></w:p><w:p/><w:p><w:pPr/><w:r><w:rPr/><w:t xml:space="preserve">   - Database PDO dipaksa menggunakan </w:t></w:r></w:p><w:p><w:pPr/><w:r><w:rPr/><w:t xml:space="preserve">SET time_zone = '+07:00'</w:t></w:r></w:p><w:p><w:pPr/><w:r><w:rPr/><w:t xml:space="preserve"> (WIB) untuk mencegah </w:t></w:r></w:p><w:p><w:pPr/><w:r><w:rPr><w:i w:val="1"/><w:iCs w:val="1"/></w:rPr><w:t xml:space="preserve">delay/offset</w:t></w:r></w:p><w:p><w:pPr/><w:r><w:rPr/><w:t xml:space="preserve"> perhitungan </w:t></w:r></w:p><w:p><w:pPr/><w:r><w:rPr><w:i w:val="1"/><w:iCs w:val="1"/></w:rPr><w:t xml:space="preserve">deadline</w:t></w:r></w:p><w:p><w:pPr/><w:r><w:rPr/><w:t xml:space="preserve"> pada aplikasi.</w:t></w:r></w:p><w:p/><w:p><w:pPr><w:numPr><w:ilvl w:val="0"/><w:numId w:val="1"/></w:numPr></w:pPr><w:r><w:rPr><w:b w:val="1"/><w:bCs w:val="1"/></w:rPr><w:t xml:space="preserve">Pembersihan File Fisik Otomatis (Hard Delete):</w:t></w:r></w:p><w:p/><w:p><w:pPr/><w:r><w:rPr/><w:t xml:space="preserve">   - Jika suatu pengumuman, tugas, atau </w:t></w:r></w:p><w:p><w:pPr/><w:r><w:rPr><w:i w:val="1"/><w:iCs w:val="1"/></w:rPr><w:t xml:space="preserve">submission</w:t></w:r></w:p><w:p><w:pPr/><w:r><w:rPr/><w:t xml:space="preserve"> dihapus, sistem tidak hanya menghapus </w:t></w:r></w:p><w:p><w:pPr/><w:r><w:rPr><w:i w:val="1"/><w:iCs w:val="1"/></w:rPr><w:t xml:space="preserve">record</w:t></w:r></w:p><w:p><w:pPr/><w:r><w:rPr/><w:t xml:space="preserve"> di database, melainkan juga mengeksekusi </w:t></w:r></w:p><w:p><w:pPr/><w:r><w:rPr/><w:t xml:space="preserve">unlink()</w:t></w:r></w:p><w:p><w:pPr/><w:r><w:rPr/><w:t xml:space="preserve"> untuk memastikan </w:t></w:r></w:p><w:p><w:pPr/><w:r><w:rPr><w:i w:val="1"/><w:iCs w:val="1"/></w:rPr><w:t xml:space="preserve">physical file</w:t></w:r></w:p><w:p><w:pPr/><w:r><w:rPr/><w:t xml:space="preserve"> pada folder </w:t></w:r></w:p><w:p><w:pPr/><w:r><w:rPr/><w:t xml:space="preserve">uploads/</w:t></w:r></w:p><w:p><w:pPr/><w:r><w:rPr/><w:t xml:space="preserve"> terhapus selamanya, mencegah kebocoran penyimpanan (storage leak).</w:t></w:r></w:p><w:p/><w:p><w:pPr><w:numPr><w:ilvl w:val="0"/><w:numId w:val="1"/></w:numPr></w:pPr><w:r><w:rPr><w:b w:val="1"/><w:bCs w:val="1"/></w:rPr><w:t xml:space="preserve">Session-based Flash Messages:</w:t></w:r></w:p><w:p/><w:p><w:pPr/><w:r><w:rPr/><w:t xml:space="preserve">   - Semua respons notifikasi kepada pengguna (misal: "Tugas berhasil dikumpulkan", "Akses ditolak") disampaikan menggunakan </w:t></w:r></w:p><w:p><w:pPr/><w:r><w:rPr><w:i w:val="1"/><w:iCs w:val="1"/></w:rPr><w:t xml:space="preserve">Flash Messages</w:t></w:r></w:p><w:p><w:pPr/><w:r><w:rPr/><w:t xml:space="preserve"> berbasis sesi murni (</w:t></w:r></w:p><w:p><w:pPr/><w:r><w:rPr/><w:t xml:space="preserve">includes/functions.php</w:t></w:r></w:p><w:p><w:pPr/><w:r><w:rPr/><w:t xml:space="preserve">), menjamin antarmuka yang bersih dari parameter URL yang memalukan/bisa dimanipulasi.</w:t></w:r></w:p><w:p/><w:p/><w:p><w:pPr/><w:r><w:rPr/><w:t xml:space="preserve">---</w:t></w:r></w:p><w:p/><w:p><w:pPr/><w:r><w:rPr><w:i w:val="1"/><w:iCs w:val="1"/></w:rPr><w:t xml:space="preserve">Silakan salin draf ini untuk memperbarui dokumen SKPL resmi Anda.</w:t></w:r></w:p><w:p/><w:sectPr><w:pgSz w:orient="portrait" w:w="11905.511811023622" w:h="16837.79527559055"/><w:pgMar w:top="1440" w:right="1440" w:bottom="1440" w:left="1440" w:header="720" w:footer="720" w:gutter="0"/><w:cols w:num="1" w:space="720"/></w:sectPr></w:body></w:document>
+<w:document xmlns:ve="http://schemas.openxmlformats.org/markup-compatibility/2006" xmlns:o="urn:schemas-microsoft-com:office:office" xmlns:r="http://schemas.openxmlformats.org/officeDocument/2006/relationships" xmlns:m="http://schemas.openxmlformats.org/officeDocument/2006/math" xmlns:v="urn:schemas-microsoft-com:vml" xmlns:wp="http://schemas.openxmlformats.org/drawingml/2006/wordprocessingDrawing" xmlns:w10="urn:schemas-microsoft-com:office:word" xmlns:w="http://schemas.openxmlformats.org/wordprocessingml/2006/main" xmlns:wne="http://schemas.microsoft.com/office/word/2006/wordml"><w:body><w:p><w:pPr><w:spacing w:after="200"/></w:pPr><w:r><w:rPr><w:color w:val="1a1a2e"/><w:sz w:val="32"/><w:szCs w:val="32"/><w:b w:val="1"/><w:bCs w:val="1"/></w:rPr><w:t xml:space="preserve">DRAFT UPDATE SKPL (Spesifikasi Kebutuhan Perangkat Lunak)</w:t></w:r></w:p><w:p><w:pPr><w:spacing w:after="200"/></w:pPr><w:r><w:rPr><w:color w:val="1a1a2e"/><w:sz w:val="32"/><w:szCs w:val="32"/><w:b w:val="1"/><w:bCs w:val="1"/></w:rPr><w:t xml:space="preserve">PrakCheck — Platform LMS Manajemen Praktikum</w:t></w:r></w:p><w:p/><w:p><w:pPr><w:spacing w:after="80"/></w:pPr><w:r><w:rPr><w:sz w:val="22"/><w:szCs w:val="22"/><w:i w:val="1"/><w:iCs w:val="1"/></w:rPr><w:t xml:space="preserve">Revisi ini menyajikan use case sistem produksi PrakCheck yang terurut secara logis dan 100% akurat berdasarkan implementasi kode yang telah berjalan.</w:t></w:r><w:r><w:rPr><w:sz w:val="22"/><w:szCs w:val="22"/></w:rPr><w:t xml:space="preserve">Revisi ini menyajikan use case sistem produksi PrakCheck yang terurut secara logis dan 100% akurat berdasarkan implementasi kode yang telah berjalan.</w:t></w:r></w:p><w:p/><w:p><w:pPr/><w:r><w:pict><v:shape id="_x0000_s1006" type="#_x0000_t32" style="margin-left:0pt; margin-top:0pt; mso-position-horizontal:left; mso-position-vertical:top; mso-position-horizontal-relative:char; mso-position-vertical-relative:line;"><w10:wrap type="inline"/><v:stroke weight="1pt" color="cccccc"/></v:shape></w:pict></w:r></w:p><w:p/><w:p/><w:p><w:pPr><w:spacing w:before="200" w:after="120"/></w:pPr><w:r><w:rPr><w:color w:val="1a237e"/><w:sz w:val="28"/><w:szCs w:val="28"/><w:b w:val="1"/><w:bCs w:val="1"/></w:rPr><w:t xml:space="preserve">1. Deskripsi Umum Sistem</w:t></w:r></w:p><w:p/><w:p><w:pPr><w:spacing w:after="80"/></w:pPr><w:r><w:rPr><w:sz w:val="22"/><w:szCs w:val="22"/></w:rPr><w:t xml:space="preserve">PrakCheck adalah sebuah platform </w:t></w:r><w:r><w:rPr><w:sz w:val="22"/><w:szCs w:val="22"/><w:b w:val="1"/><w:bCs w:val="1"/></w:rPr><w:t xml:space="preserve">Learning Management System (LMS) berbasis web khusus praktikum</w:t></w:r><w:r><w:rPr><w:sz w:val="22"/><w:szCs w:val="22"/></w:rPr><w:t xml:space="preserve">Learning Management System (LMS) berbasis web khusus praktikum</w:t></w:r><w:r><w:rPr><w:sz w:val="22"/><w:szCs w:val="22"/></w:rPr><w:t xml:space="preserve"> yang dibangun menggunakan PHP Native, MySQL, dan Bootstrap 5. Sistem ini mengelola siklus lengkap praktikum: mulai dari pendaftaran akun, pembuatan kelas, distribusi tugas, pengumpulan file oleh mahasiswa, pemeriksaan kemiripan antar dokumen (plagiarisme), hingga penilaian akhir dan ekspor laporan nilai.</w:t></w:r></w:p><w:p/><w:p><w:pPr><w:spacing w:after="80"/></w:pPr><w:r><w:rPr><w:sz w:val="22"/><w:szCs w:val="22"/></w:rPr><w:t xml:space="preserve">Sistem memiliki dua level peran pengguna dengan hak akses yang berbeda: </w:t></w:r><w:r><w:rPr><w:sz w:val="22"/><w:szCs w:val="22"/><w:b w:val="1"/><w:bCs w:val="1"/></w:rPr><w:t xml:space="preserve">Asisten Praktikum (Asprak)</w:t></w:r><w:r><w:rPr><w:sz w:val="22"/><w:szCs w:val="22"/></w:rPr><w:t xml:space="preserve">Asisten Praktikum (Asprak)</w:t></w:r><w:r><w:rPr><w:sz w:val="22"/><w:szCs w:val="22"/></w:rPr><w:t xml:space="preserve"> dan </w:t></w:r><w:r><w:rPr><w:sz w:val="22"/><w:szCs w:val="22"/><w:b w:val="1"/><w:bCs w:val="1"/></w:rPr><w:t xml:space="preserve">Mahasiswa</w:t></w:r><w:r><w:rPr><w:sz w:val="22"/><w:szCs w:val="22"/></w:rPr><w:t xml:space="preserve">Mahasiswa</w:t></w:r><w:r><w:rPr><w:sz w:val="22"/><w:szCs w:val="22"/></w:rPr><w:t xml:space="preserve">.</w:t></w:r></w:p><w:p/><w:p><w:pPr/><w:r><w:pict><v:shape id="_x0000_s1015" type="#_x0000_t32" style="margin-left:0pt; margin-top:0pt; mso-position-horizontal:left; mso-position-vertical:top; mso-position-horizontal-relative:char; mso-position-vertical-relative:line;"><w10:wrap type="inline"/><v:stroke weight="1pt" color="cccccc"/></v:shape></w:pict></w:r></w:p><w:p/><w:p/><w:p><w:pPr><w:spacing w:before="200" w:after="120"/></w:pPr><w:r><w:rPr><w:color w:val="1a237e"/><w:sz w:val="28"/><w:szCs w:val="28"/><w:b w:val="1"/><w:bCs w:val="1"/></w:rPr><w:t xml:space="preserve">2. Aktor Sistem</w:t></w:r></w:p><w:p/><w:p/><w:p><w:pPr/><w:r><w:pict><v:shape id="_x0000_s1021" type="#_x0000_t32" style="margin-left:0pt; margin-top:0pt; mso-position-horizontal:left; mso-position-vertical:top; mso-position-horizontal-relative:char; mso-position-vertical-relative:line;"><w10:wrap type="inline"/><v:stroke weight="1pt" color="cccccc"/></v:shape></w:pict></w:r></w:p><w:p/><w:p/><w:p><w:pPr><w:spacing w:before="200" w:after="120"/></w:pPr><w:r><w:rPr><w:color w:val="1a237e"/><w:sz w:val="28"/><w:szCs w:val="28"/><w:b w:val="1"/><w:bCs w:val="1"/></w:rPr><w:t xml:space="preserve">3. Daftar Use Case (Terurut & Akurat dengan Alur Sistem Produksi)</w:t></w:r></w:p><w:p/><w:p><w:pPr><w:spacing w:after="60"/></w:pPr><w:r><w:rPr><w:color w:val="555555"/><w:sz w:val="20"/><w:szCs w:val="20"/><w:i w:val="1"/><w:iCs w:val="1"/></w:rPr><w:t xml:space="preserve">Catatan Urutan: Use case di bawah ini diurutkan sesuai dengan alur kerja nyata dari awal (pendaftaran akun) hingga akhir (ekspor laporan nilai).</w:t></w:r></w:p><w:p/><w:p><w:pPr/><w:r><w:pict><v:shape id="_x0000_s1028" type="#_x0000_t32" style="margin-left:0pt; margin-top:0pt; mso-position-horizontal:left; mso-position-vertical:top; mso-position-horizontal-relative:char; mso-position-vertical-relative:line;"><w10:wrap type="inline"/><v:stroke weight="1pt" color="cccccc"/></v:shape></w:pict></w:r></w:p><w:p/><w:p/><w:p><w:pPr><w:spacing w:before="240" w:after="60"/></w:pPr><w:r><w:rPr><w:color w:val="546e7a"/><w:sz w:val="22"/><w:szCs w:val="22"/><w:b w:val="1"/><w:bCs w:val="1"/><w:i w:val="1"/><w:iCs w:val="1"/></w:rPr><w:t xml:space="preserve">— FASE 1: MANAJEMEN AKUN —</w:t></w:r></w:p><w:p/><w:p><w:pPr><w:spacing w:before="180" w:after="80"/></w:pPr><w:r><w:rPr><w:color w:val="1565c0"/><w:sz w:val="24"/><w:szCs w:val="24"/><w:b w:val="1"/><w:bCs w:val="1"/></w:rPr><w:t xml:space="preserve">UC-01: Registrasi Akun Baru</w:t></w:r></w:p><w:p><w:pPr><w:spacing w:after="60"/><w:numPr><w:ilvl w:val="0"/><w:numId w:val=""/></w:numPr></w:pPr><w:r><w:rPr><w:sz w:val="22"/><w:szCs w:val="22"/></w:rPr><w:t xml:space="preserve">Aktor: Calon Asprak / Calon Mahasiswa</w:t></w:r></w:p><w:p><w:pPr><w:spacing w:after="60"/><w:numPr><w:ilvl w:val="0"/><w:numId w:val=""/></w:numPr></w:pPr><w:r><w:rPr><w:sz w:val="22"/><w:szCs w:val="22"/></w:rPr><w:t xml:space="preserve">Deskripsi: Pengguna mendaftarkan akun baru dengan mengisi nama lengkap, email, password, dan memilih peran (Role).</w:t></w:r></w:p><w:p><w:pPr><w:spacing w:after="60"/><w:numPr><w:ilvl w:val="0"/><w:numId w:val=""/></w:numPr></w:pPr><w:r><w:rPr><w:sz w:val="22"/><w:szCs w:val="22"/></w:rPr><w:t xml:space="preserve">Jika mendaftar sebagai Mahasiswa: akun langsung dibuat setelah validasi data.</w:t></w:r></w:p><w:p><w:pPr><w:spacing w:after="60"/><w:numPr><w:ilvl w:val="0"/><w:numId w:val=""/></w:numPr></w:pPr><w:r><w:rPr><w:sz w:val="22"/><w:szCs w:val="22"/></w:rPr><w:t xml:space="preserve">Jika mendaftar sebagai Asisten: pengguna wajib memasukkan Kode Rahasia Asisten yang hanya diketahui oleh pengelola sistem. Kode ini berfungsi sebagai gerbang keamanan agar mahasiswa tidak bisa mendaftar sebagai Asprak secara sembarangan.</w:t></w:r></w:p><w:p><w:pPr><w:spacing w:after="60"/><w:numPr><w:ilvl w:val="0"/><w:numId w:val=""/></w:numPr></w:pPr><w:r><w:rPr><w:sz w:val="22"/><w:szCs w:val="22"/></w:rPr><w:t xml:space="preserve">Validasi: Email tidak boleh terdaftar ganda, password minimal 6 karakter, format email harus valid.</w:t></w:r></w:p><w:p><w:pPr><w:spacing w:after="60"/><w:numPr><w:ilvl w:val="0"/><w:numId w:val=""/></w:numPr></w:pPr><w:r><w:rPr><w:sz w:val="22"/><w:szCs w:val="22"/></w:rPr><w:t xml:space="preserve">Keamanan: Password disimpan dalam bentuk hash kriptografis, bukan teks biasa.</w:t></w:r></w:p><w:p/><w:p><w:pPr><w:spacing w:before="180" w:after="80"/></w:pPr><w:r><w:rPr><w:color w:val="1565c0"/><w:sz w:val="24"/><w:szCs w:val="24"/><w:b w:val="1"/><w:bCs w:val="1"/></w:rPr><w:t xml:space="preserve">UC-02: Login ke Sistem</w:t></w:r></w:p><w:p><w:pPr><w:spacing w:after="60"/><w:numPr><w:ilvl w:val="0"/><w:numId w:val=""/></w:numPr></w:pPr><w:r><w:rPr><w:sz w:val="22"/><w:szCs w:val="22"/></w:rPr><w:t xml:space="preserve">Aktor: Semua pengguna terdaftar</w:t></w:r></w:p><w:p><w:pPr><w:spacing w:after="60"/><w:numPr><w:ilvl w:val="0"/><w:numId w:val=""/></w:numPr></w:pPr><w:r><w:rPr><w:sz w:val="22"/><w:szCs w:val="22"/></w:rPr><w:t xml:space="preserve">Deskripsi: Pengguna masuk ke sistem menggunakan kombinasi email dan password. Sistem memverifikasi kecocokan hash password. Setelah berhasil, sesi login dibuat dan pengguna diarahkan ke halaman Dashboard sesuai peran mereka.</w:t></w:r></w:p><w:p/><w:p><w:pPr><w:spacing w:before="180" w:after="80"/></w:pPr><w:r><w:rPr><w:color w:val="1565c0"/><w:sz w:val="24"/><w:szCs w:val="24"/><w:b w:val="1"/><w:bCs w:val="1"/></w:rPr><w:t xml:space="preserve">UC-03: Pemulihan Password (Lupa Password)</w:t></w:r></w:p><w:p><w:pPr><w:spacing w:after="60"/><w:numPr><w:ilvl w:val="0"/><w:numId w:val=""/></w:numPr></w:pPr><w:r><w:rPr><w:sz w:val="22"/><w:szCs w:val="22"/></w:rPr><w:t xml:space="preserve">Aktor: Semua pengguna terdaftar</w:t></w:r></w:p><w:p><w:pPr><w:spacing w:after="60"/><w:numPr><w:ilvl w:val="0"/><w:numId w:val=""/></w:numPr></w:pPr><w:r><w:rPr><w:sz w:val="22"/><w:szCs w:val="22"/></w:rPr><w:t xml:space="preserve">Deskripsi: Pengguna yang lupa kata sandi dapat mengajukan permintaan reset melalui formulir "Lupa Password". Sistem mengirimkan tautan reset bertanda waktu dan bersifat sekali pakai ke alamat email terdaftar pengguna melalui layanan SMTP. Pengguna kemudian dapat menetapkan password baru melalui tautan tersebut.</w:t></w:r></w:p><w:p/><w:p><w:pPr><w:spacing w:before="180" w:after="80"/></w:pPr><w:r><w:rPr><w:color w:val="1565c0"/><w:sz w:val="24"/><w:szCs w:val="24"/><w:b w:val="1"/><w:bCs w:val="1"/></w:rPr><w:t xml:space="preserve">UC-04: Logout dari Sistem</w:t></w:r></w:p><w:p><w:pPr><w:spacing w:after="60"/><w:numPr><w:ilvl w:val="0"/><w:numId w:val=""/></w:numPr></w:pPr><w:r><w:rPr><w:sz w:val="22"/><w:szCs w:val="22"/></w:rPr><w:t xml:space="preserve">Aktor: Semua pengguna yang sudah login</w:t></w:r></w:p><w:p><w:pPr><w:spacing w:after="60"/><w:numPr><w:ilvl w:val="0"/><w:numId w:val=""/></w:numPr></w:pPr><w:r><w:rPr><w:sz w:val="22"/><w:szCs w:val="22"/></w:rPr><w:t xml:space="preserve">Deskripsi: Menghancurkan sesi login pengguna secara aman dan mengarahkan kembali ke halaman login.</w:t></w:r></w:p><w:p/><w:p><w:pPr><w:spacing w:before="180" w:after="80"/></w:pPr><w:r><w:rPr><w:color w:val="1565c0"/><w:sz w:val="24"/><w:szCs w:val="24"/><w:b w:val="1"/><w:bCs w:val="1"/></w:rPr><w:t xml:space="preserve">UC-05: Pembaruan Kode Rahasia Asisten</w:t></w:r></w:p><w:p><w:pPr><w:spacing w:after="60"/><w:numPr><w:ilvl w:val="0"/><w:numId w:val=""/></w:numPr></w:pPr><w:r><w:rPr><w:sz w:val="22"/><w:szCs w:val="22"/></w:rPr><w:t xml:space="preserve">Aktor: Asprak (yang sudah login)</w:t></w:r></w:p><w:p><w:pPr><w:spacing w:after="60"/><w:numPr><w:ilvl w:val="0"/><w:numId w:val=""/></w:numPr></w:pPr><w:r><w:rPr><w:sz w:val="22"/><w:szCs w:val="22"/></w:rPr><w:t xml:space="preserve">Deskripsi: Asisten dapat mengubah "Kode Rahasia Pendaftaran Asisten" secara mandiri langsung dari panel Dashboard tanpa perlu mengedit konfigurasi server. Fitur ini tersedia apabila kode yang beredar dikhawatirkan telah bocor ke pihak yang tidak berwenang. Setiap perubahan dilindungi oleh mekanisme token CSRF.</w:t></w:r></w:p><w:p/><w:p><w:pPr/><w:r><w:pict><v:shape id="_x0000_s1057" type="#_x0000_t32" style="margin-left:0pt; margin-top:0pt; mso-position-horizontal:left; mso-position-vertical:top; mso-position-horizontal-relative:char; mso-position-vertical-relative:line;"><w10:wrap type="inline"/><v:stroke weight="1pt" color="cccccc"/></v:shape></w:pict></w:r></w:p><w:p/><w:p/><w:p><w:pPr><w:spacing w:before="240" w:after="60"/></w:pPr><w:r><w:rPr><w:color w:val="546e7a"/><w:sz w:val="22"/><w:szCs w:val="22"/><w:b w:val="1"/><w:bCs w:val="1"/><w:i w:val="1"/><w:iCs w:val="1"/></w:rPr><w:t xml:space="preserve">— FASE 2: MANAJEMEN KELAS (ASPRAK) —</w:t></w:r></w:p><w:p/><w:p><w:pPr><w:spacing w:before="180" w:after="80"/></w:pPr><w:r><w:rPr><w:color w:val="1565c0"/><w:sz w:val="24"/><w:szCs w:val="24"/><w:b w:val="1"/><w:bCs w:val="1"/></w:rPr><w:t xml:space="preserve">UC-06: Membuat Kelas Baru</w:t></w:r></w:p><w:p><w:pPr><w:spacing w:after="60"/><w:numPr><w:ilvl w:val="0"/><w:numId w:val=""/></w:numPr></w:pPr><w:r><w:rPr><w:sz w:val="22"/><w:szCs w:val="22"/></w:rPr><w:t xml:space="preserve">Aktor: Asprak</w:t></w:r></w:p><w:p><w:pPr><w:spacing w:after="60"/><w:numPr><w:ilvl w:val="0"/><w:numId w:val=""/></w:numPr></w:pPr><w:r><w:rPr><w:sz w:val="22"/><w:szCs w:val="22"/></w:rPr><w:t xml:space="preserve">Kondisi Prasyarat: Akun Asprak sudah terdaftar dan sudah login (UC-01, UC-02).</w:t></w:r></w:p><w:p><w:pPr><w:spacing w:after="60"/><w:numPr><w:ilvl w:val="0"/><w:numId w:val=""/></w:numPr></w:pPr><w:r><w:rPr><w:sz w:val="22"/><w:szCs w:val="22"/></w:rPr><w:t xml:space="preserve">Deskripsi: Asprak mendirikan kelas baru dengan menginputkan nama kelas (contoh: Pemrograman Web — Kelas A). Sistem secara otomatis menghasilkan Kode Kelas unik berisi 8 karakter alfanumerik yang dapat dibagikan kepada mahasiswa sebagai akses masuk kelas. Seorang Asprak dapat mengelola banyak kelas secara bersamaan.</w:t></w:r></w:p><w:p><w:pPr><w:spacing w:after="60"/><w:numPr><w:ilvl w:val="0"/><w:numId w:val=""/></w:numPr></w:pPr><w:r><w:rPr><w:sz w:val="22"/><w:szCs w:val="22"/></w:rPr><w:t xml:space="preserve">Kondisi Akhir: Kelas baru muncul di Dashboard Asprak beserta Kode Kelas yang siap dibagikan.</w:t></w:r></w:p><w:p/><w:p><w:pPr/><w:r><w:pict><v:shape id="_x0000_s1068" type="#_x0000_t32" style="margin-left:0pt; margin-top:0pt; mso-position-horizontal:left; mso-position-vertical:top; mso-position-horizontal-relative:char; mso-position-vertical-relative:line;"><w10:wrap type="inline"/><v:stroke weight="1pt" color="cccccc"/></v:shape></w:pict></w:r></w:p><w:p/><w:p/><w:p><w:pPr><w:spacing w:before="240" w:after="60"/></w:pPr><w:r><w:rPr><w:color w:val="546e7a"/><w:sz w:val="22"/><w:szCs w:val="22"/><w:b w:val="1"/><w:bCs w:val="1"/><w:i w:val="1"/><w:iCs w:val="1"/></w:rPr><w:t xml:space="preserve">— FASE 3: PENDAFTARAN MAHASISWA KE KELAS —</w:t></w:r></w:p><w:p/><w:p><w:pPr><w:spacing w:before="180" w:after="80"/></w:pPr><w:r><w:rPr><w:color w:val="1565c0"/><w:sz w:val="24"/><w:szCs w:val="24"/><w:b w:val="1"/><w:bCs w:val="1"/></w:rPr><w:t xml:space="preserve">UC-07: Bergabung ke Kelas (Self-Enrollment)</w:t></w:r></w:p><w:p><w:pPr><w:spacing w:after="60"/><w:numPr><w:ilvl w:val="0"/><w:numId w:val=""/></w:numPr></w:pPr><w:r><w:rPr><w:sz w:val="22"/><w:szCs w:val="22"/></w:rPr><w:t xml:space="preserve">Aktor: Mahasiswa</w:t></w:r></w:p><w:p><w:pPr><w:spacing w:after="60"/><w:numPr><w:ilvl w:val="0"/><w:numId w:val=""/></w:numPr></w:pPr><w:r><w:rPr><w:sz w:val="22"/><w:szCs w:val="22"/></w:rPr><w:t xml:space="preserve">Kondisi Prasyarat: Mahasiswa sudah login (UC-02). Asprak sudah membuat kelas dan membagikan Kode Kelas (UC-06).</w:t></w:r></w:p><w:p><w:pPr><w:spacing w:after="60"/><w:numPr><w:ilvl w:val="0"/><w:numId w:val=""/></w:numPr></w:pPr><w:r><w:rPr><w:sz w:val="22"/><w:szCs w:val="22"/></w:rPr><w:t xml:space="preserve">Deskripsi: Mahasiswa bergabung ke kelas secara mandiri dengan memasukkan Kode Kelas yang diterima dari Asprak. Sistem memvalidasi kode, kemudian mendaftarkan mahasiswa ke dalam kelas tersebut.</w:t></w:r></w:p><w:p><w:pPr><w:spacing w:after="60"/><w:numPr><w:ilvl w:val="0"/><w:numId w:val=""/></w:numPr></w:pPr><w:r><w:rPr><w:sz w:val="22"/><w:szCs w:val="22"/></w:rPr><w:t xml:space="preserve">Kondisi Akhir: Kelas muncul di daftar kelas mahasiswa di Dashboard. Mahasiswa selanjutnya dapat melihat pengumuman dan tugas dari kelas tersebut.</w:t></w:r></w:p><w:p/><w:p><w:pPr/><w:r><w:pict><v:shape id="_x0000_s1079" type="#_x0000_t32" style="margin-left:0pt; margin-top:0pt; mso-position-horizontal:left; mso-position-vertical:top; mso-position-horizontal-relative:char; mso-position-vertical-relative:line;"><w10:wrap type="inline"/><v:stroke weight="1pt" color="cccccc"/></v:shape></w:pict></w:r></w:p><w:p/><w:p/><w:p><w:pPr><w:spacing w:before="240" w:after="60"/></w:pPr><w:r><w:rPr><w:color w:val="546e7a"/><w:sz w:val="22"/><w:szCs w:val="22"/><w:b w:val="1"/><w:bCs w:val="1"/><w:i w:val="1"/><w:iCs w:val="1"/></w:rPr><w:t xml:space="preserve">— FASE 4: PENGELOLAAN KONTEN KELAS (ASPRAK) —</w:t></w:r></w:p><w:p/><w:p><w:pPr><w:spacing w:before="180" w:after="80"/></w:pPr><w:r><w:rPr><w:color w:val="1565c0"/><w:sz w:val="24"/><w:szCs w:val="24"/><w:b w:val="1"/><w:bCs w:val="1"/></w:rPr><w:t xml:space="preserve">UC-08: Memposting Pengumuman Kelas</w:t></w:r></w:p><w:p><w:pPr><w:spacing w:after="60"/><w:numPr><w:ilvl w:val="0"/><w:numId w:val=""/></w:numPr></w:pPr><w:r><w:rPr><w:sz w:val="22"/><w:szCs w:val="22"/></w:rPr><w:t xml:space="preserve">Aktor: Asprak</w:t></w:r></w:p><w:p><w:pPr><w:spacing w:after="60"/><w:numPr><w:ilvl w:val="0"/><w:numId w:val=""/></w:numPr></w:pPr><w:r><w:rPr><w:sz w:val="22"/><w:szCs w:val="22"/></w:rPr><w:t xml:space="preserve">Kondisi Prasyarat: Kelas sudah ada dan Asprak adalah pemiliknya (UC-06).</w:t></w:r></w:p><w:p><w:pPr><w:spacing w:after="60"/><w:numPr><w:ilvl w:val="0"/><w:numId w:val=""/></w:numPr></w:pPr><w:r><w:rPr><w:sz w:val="22"/><w:szCs w:val="22"/></w:rPr><w:t xml:space="preserve">Deskripsi: Asprak memposting pengumuman berisi judul dan konten teks yang dapat dilihat oleh seluruh anggota kelas. Asprak dapat melampirkan file pendukung seperti modul praktikum atau slide presentasi. Pengumuman dapat diedit dan dihapus kapan saja; penghapusan juga membersihkan file lampiran secara permanen dari server.</w:t></w:r></w:p><w:p/><w:p><w:pPr><w:spacing w:before="180" w:after="80"/></w:pPr><w:r><w:rPr><w:color w:val="1565c0"/><w:sz w:val="24"/><w:szCs w:val="24"/><w:b w:val="1"/><w:bCs w:val="1"/></w:rPr><w:t xml:space="preserve">UC-09: Membuat Modul Tugas (Assignment)</w:t></w:r></w:p><w:p><w:pPr><w:spacing w:after="60"/><w:numPr><w:ilvl w:val="0"/><w:numId w:val=""/></w:numPr></w:pPr><w:r><w:rPr><w:sz w:val="22"/><w:szCs w:val="22"/></w:rPr><w:t xml:space="preserve">Aktor: Asprak</w:t></w:r></w:p><w:p><w:pPr><w:spacing w:after="60"/><w:numPr><w:ilvl w:val="0"/><w:numId w:val=""/></w:numPr></w:pPr><w:r><w:rPr><w:sz w:val="22"/><w:szCs w:val="22"/></w:rPr><w:t xml:space="preserve">Kondisi Prasyarat: Kelas sudah ada dan Asprak adalah pemiliknya (UC-06).</w:t></w:r></w:p><w:p><w:pPr><w:spacing w:after="60"/><w:numPr><w:ilvl w:val="0"/><w:numId w:val=""/></w:numPr></w:pPr><w:r><w:rPr><w:sz w:val="22"/><w:szCs w:val="22"/></w:rPr><w:t xml:space="preserve">Deskripsi: Asprak membuat tugas baru untuk sebuah kelas dengan mengisi detail berikut:</w:t></w:r></w:p><w:p><w:pPr><w:spacing w:after="60"/><w:numPr><w:ilvl w:val="0"/><w:numId w:val=""/></w:numPr></w:pPr><w:r><w:rPr><w:sz w:val="22"/><w:szCs w:val="22"/></w:rPr><w:t xml:space="preserve">Judul & deskripsi instruksi pengerjaan tugas.</w:t></w:r></w:p><w:p><w:pPr><w:spacing w:after="60"/><w:numPr><w:ilvl w:val="0"/><w:numId w:val=""/></w:numPr></w:pPr><w:r><w:rPr><w:sz w:val="22"/><w:szCs w:val="22"/></w:rPr><w:t xml:space="preserve">Tipe Tenggat Waktu, pilih salah satu:</w:t></w:r></w:p><w:p><w:pPr><w:spacing w:after="80"/></w:pPr><w:r><w:rPr><w:sz w:val="22"/><w:szCs w:val="22"/></w:rPr><w:t xml:space="preserve">    - </w:t></w:r><w:r><w:rPr><w:sz w:val="22"/><w:szCs w:val="22"/><w:i w:val="1"/><w:iCs w:val="1"/></w:rPr><w:t xml:space="preserve">No Deadline</w:t></w:r><w:r><w:rPr><w:sz w:val="22"/><w:szCs w:val="22"/></w:rPr><w:t xml:space="preserve">No Deadline</w:t></w:r><w:r><w:rPr><w:sz w:val="22"/><w:szCs w:val="22"/></w:rPr><w:t xml:space="preserve"> — Mahasiswa dapat mengumpulkan kapan saja tanpa batas.</w:t></w:r></w:p><w:p><w:pPr><w:spacing w:after="80"/></w:pPr><w:r><w:rPr><w:sz w:val="22"/><w:szCs w:val="22"/></w:rPr><w:t xml:space="preserve">    - </w:t></w:r><w:r><w:rPr><w:sz w:val="22"/><w:szCs w:val="22"/><w:i w:val="1"/><w:iCs w:val="1"/></w:rPr><w:t xml:space="preserve">Soft Deadline</w:t></w:r><w:r><w:rPr><w:sz w:val="22"/><w:szCs w:val="22"/></w:rPr><w:t xml:space="preserve">Soft Deadline</w:t></w:r><w:r><w:rPr><w:sz w:val="22"/><w:szCs w:val="22"/></w:rPr><w:t xml:space="preserve"> — Pengumpulan setelah tenggat masih diterima, namun ditandai sebagai "Terlambat".</w:t></w:r></w:p><w:p><w:pPr><w:spacing w:after="80"/></w:pPr><w:r><w:rPr><w:sz w:val="22"/><w:szCs w:val="22"/></w:rPr><w:t xml:space="preserve">    - </w:t></w:r><w:r><w:rPr><w:sz w:val="22"/><w:szCs w:val="22"/><w:i w:val="1"/><w:iCs w:val="1"/></w:rPr><w:t xml:space="preserve">Strict Deadline</w:t></w:r><w:r><w:rPr><w:sz w:val="22"/><w:szCs w:val="22"/></w:rPr><w:t xml:space="preserve">Strict Deadline</w:t></w:r><w:r><w:rPr><w:sz w:val="22"/><w:szCs w:val="22"/></w:rPr><w:t xml:space="preserve"> — Sistem menutup akses pengumpulan secara otomatis tepat saat tenggat berakhir.</w:t></w:r></w:p><w:p><w:pPr><w:spacing w:after="60"/><w:numPr><w:ilvl w:val="0"/><w:numId w:val=""/></w:numPr></w:pPr><w:r><w:rPr><w:sz w:val="22"/><w:szCs w:val="22"/></w:rPr><w:t xml:space="preserve">Batasan format file yang diizinkan (misal: hanya .pdf dan .docx) dan jumlah maksimum file per pengumpulan.</w:t></w:r></w:p><w:p><w:pPr><w:spacing w:after="60"/><w:numPr><w:ilvl w:val="0"/><w:numId w:val=""/></w:numPr></w:pPr><w:r><w:rPr><w:sz w:val="22"/><w:szCs w:val="22"/></w:rPr><w:t xml:space="preserve">Aturan penalti plagiarisme otomatis: Asprak dapat mendefinisikan pasangan ambang batas kemiripan (%) dan poin penalti yang akan diterapkan secara otomatis ketika pemeriksaan plagiarisme dijalankan.</w:t></w:r></w:p><w:p><w:pPr><w:spacing w:after="60"/><w:numPr><w:ilvl w:val="0"/><w:numId w:val=""/></w:numPr></w:pPr><w:r><w:rPr><w:sz w:val="22"/><w:szCs w:val="22"/></w:rPr><w:t xml:space="preserve">Kondisi Akhir: Modul tugas baru muncul di halaman kelas dan dapat diakses oleh semua mahasiswa anggota kelas.</w:t></w:r></w:p><w:p/><w:p><w:pPr/><w:r><w:pict><v:shape id="_x0000_s1102" type="#_x0000_t32" style="margin-left:0pt; margin-top:0pt; mso-position-horizontal:left; mso-position-vertical:top; mso-position-horizontal-relative:char; mso-position-vertical-relative:line;"><w10:wrap type="inline"/><v:stroke weight="1pt" color="cccccc"/></v:shape></w:pict></w:r></w:p><w:p/><w:p/><w:p><w:pPr><w:spacing w:before="240" w:after="60"/></w:pPr><w:r><w:rPr><w:color w:val="546e7a"/><w:sz w:val="22"/><w:szCs w:val="22"/><w:b w:val="1"/><w:bCs w:val="1"/><w:i w:val="1"/><w:iCs w:val="1"/></w:rPr><w:t xml:space="preserve">— FASE 5: PENGUMPULAN TUGAS (MAHASISWA) —</w:t></w:r></w:p><w:p/><w:p><w:pPr><w:spacing w:before="180" w:after="80"/></w:pPr><w:r><w:rPr><w:color w:val="1565c0"/><w:sz w:val="24"/><w:szCs w:val="24"/><w:b w:val="1"/><w:bCs w:val="1"/></w:rPr><w:t xml:space="preserve">UC-10: Mengumpulkan Tugas</w:t></w:r></w:p><w:p><w:pPr><w:spacing w:after="60"/><w:numPr><w:ilvl w:val="0"/><w:numId w:val=""/></w:numPr></w:pPr><w:r><w:rPr><w:sz w:val="22"/><w:szCs w:val="22"/></w:rPr><w:t xml:space="preserve">Aktor: Mahasiswa</w:t></w:r></w:p><w:p><w:pPr><w:spacing w:after="60"/><w:numPr><w:ilvl w:val="0"/><w:numId w:val=""/></w:numPr></w:pPr><w:r><w:rPr><w:sz w:val="22"/><w:szCs w:val="22"/></w:rPr><w:t xml:space="preserve">Kondisi Prasyarat: Mahasiswa sudah terdaftar di kelas (UC-07). Modul tugas sudah dibuat oleh Asprak (UC-09). Tenggat waktu belum berakhir (untuk Strict Deadline).</w:t></w:r></w:p><w:p><w:pPr><w:spacing w:after="60"/><w:numPr><w:ilvl w:val="0"/><w:numId w:val=""/></w:numPr></w:pPr><w:r><w:rPr><w:sz w:val="22"/><w:szCs w:val="22"/></w:rPr><w:t xml:space="preserve">Deskripsi: Mahasiswa mengunggah file tugas melalui antarmuka seret-dan-jatuhkan (drag & drop). Pengumpulan berlangsung dalam dua tahap:</w:t></w:r></w:p><w:p><w:pPr><w:spacing w:after="60"/><w:numPr><w:ilvl w:val="0"/><w:numId w:val=""/></w:numPr></w:pPr><w:r><w:rPr><w:sz w:val="22"/><w:szCs w:val="22"/></w:rPr><w:t xml:space="preserve">Tahap Draft: File berhasil terunggah namun belum dikumpulkan secara resmi. Pada tahap ini, mahasiswa masih bebas menghapus, mengganti, atau menambahkan file baru.</w:t></w:r></w:p><w:p><w:pPr><w:spacing w:after="60"/><w:numPr><w:ilvl w:val="0"/><w:numId w:val=""/></w:numPr></w:pPr><w:r><w:rPr><w:sz w:val="22"/><w:szCs w:val="22"/></w:rPr><w:t xml:space="preserve">Tahap Final Submit: Mahasiswa mengkonfirmasi pengumpulan akhir. Status berubah menjadi "Dikumpulkan", file terkunci dari perubahan lebih lanjut, dan sistem mencatat waktu pengumpulan secara akurat untuk keperluan validasi keterlambatan.</w:t></w:r></w:p><w:p/><w:p><w:pPr/><w:r><w:pict><v:shape id="_x0000_s1114" type="#_x0000_t32" style="margin-left:0pt; margin-top:0pt; mso-position-horizontal:left; mso-position-vertical:top; mso-position-horizontal-relative:char; mso-position-vertical-relative:line;"><w10:wrap type="inline"/><v:stroke weight="1pt" color="cccccc"/></v:shape></w:pict></w:r></w:p><w:p/><w:p/><w:p><w:pPr><w:spacing w:before="240" w:after="60"/></w:pPr><w:r><w:rPr><w:color w:val="546e7a"/><w:sz w:val="22"/><w:szCs w:val="22"/><w:b w:val="1"/><w:bCs w:val="1"/><w:i w:val="1"/><w:iCs w:val="1"/></w:rPr><w:t xml:space="preserve">— FASE 6: KOREKSI & PENILAIAN (ASPRAK) —</w:t></w:r></w:p><w:p/><w:p><w:pPr><w:spacing w:before="180" w:after="80"/></w:pPr><w:r><w:rPr><w:color w:val="1565c0"/><w:sz w:val="24"/><w:szCs w:val="24"/><w:b w:val="1"/><w:bCs w:val="1"/></w:rPr><w:t xml:space="preserve">UC-11: Melihat Pratinjau File Tugas (In-Browser Preview)</w:t></w:r></w:p><w:p><w:pPr><w:spacing w:after="60"/><w:numPr><w:ilvl w:val="0"/><w:numId w:val=""/></w:numPr></w:pPr><w:r><w:rPr><w:sz w:val="22"/><w:szCs w:val="22"/></w:rPr><w:t xml:space="preserve">Aktor: Asprak & Mahasiswa</w:t></w:r></w:p><w:p><w:pPr><w:spacing w:after="60"/><w:numPr><w:ilvl w:val="0"/><w:numId w:val=""/></w:numPr></w:pPr><w:r><w:rPr><w:sz w:val="22"/><w:szCs w:val="22"/></w:rPr><w:t xml:space="preserve">Deskripsi: Pengguna dapat melihat isi file yang diunggah langsung di dalam browser tanpa harus mengunduhnya terlebih dahulu. Format file yang didukung:</w:t></w:r></w:p><w:p><w:pPr><w:spacing w:after="60"/><w:numPr><w:ilvl w:val="0"/><w:numId w:val=""/></w:numPr></w:pPr><w:r><w:rPr><w:sz w:val="22"/><w:szCs w:val="22"/></w:rPr><w:t xml:space="preserve">Dokumen PDF — dirender langsung oleh browser.</w:t></w:r></w:p><w:p><w:pPr><w:spacing w:after="60"/><w:numPr><w:ilvl w:val="0"/><w:numId w:val=""/></w:numPr></w:pPr><w:r><w:rPr><w:sz w:val="22"/><w:szCs w:val="22"/></w:rPr><w:t xml:space="preserve">Dokumen Word (.docx/.doc) — dikonversi menjadi HTML dan ditampilkan langsung di halaman.</w:t></w:r></w:p><w:p><w:pPr><w:spacing w:after="60"/><w:numPr><w:ilvl w:val="0"/><w:numId w:val=""/></w:numPr></w:pPr><w:r><w:rPr><w:sz w:val="22"/><w:szCs w:val="22"/></w:rPr><w:t xml:space="preserve">File Gambar — .jpg, .png, .gif, .webp ditampilkan secara langsung.</w:t></w:r></w:p><w:p><w:pPr><w:spacing w:after="60"/><w:numPr><w:ilvl w:val="0"/><w:numId w:val=""/></w:numPr></w:pPr><w:r><w:rPr><w:sz w:val="22"/><w:szCs w:val="22"/></w:rPr><w:t xml:space="preserve">File Video — .mp4, .webm diputar menggunakan pemutar video HTML5 bawaan.</w:t></w:r></w:p><w:p><w:pPr><w:spacing w:after="60"/><w:numPr><w:ilvl w:val="0"/><w:numId w:val=""/></w:numPr></w:pPr><w:r><w:rPr><w:sz w:val="22"/><w:szCs w:val="22"/></w:rPr><w:t xml:space="preserve">File Teks & Kode Sumber — .txt, .php, .sql, .js, .css, .json, .md, .csv ditampilkan dalam blok kode bertema gelap yang rapi.</w:t></w:r></w:p><w:p><w:pPr><w:spacing w:after="60"/><w:numPr><w:ilvl w:val="0"/><w:numId w:val=""/></w:numPr></w:pPr><w:r><w:rPr><w:sz w:val="22"/><w:szCs w:val="22"/></w:rPr><w:t xml:space="preserve">Keamanan: Sebuah file hanya dapat diakses oleh pemilik file itu sendiri (mahasiswa yang mengunggah) atau Asprak dari kelas yang menaungi file tersebut. Permintaan dari pengguna yang tidak terotorisasi akan ditolak.</w:t></w:r></w:p><w:p/><w:p><w:pPr><w:spacing w:before="180" w:after="80"/></w:pPr><w:r><w:rPr><w:color w:val="1565c0"/><w:sz w:val="24"/><w:szCs w:val="24"/><w:b w:val="1"/><w:bCs w:val="1"/></w:rPr><w:t xml:space="preserve">UC-12: Pemeriksaan & Deteksi Plagiarisme Lintas Dokumen</w:t></w:r></w:p><w:p><w:pPr><w:spacing w:after="60"/><w:numPr><w:ilvl w:val="0"/><w:numId w:val=""/></w:numPr></w:pPr><w:r><w:rPr><w:sz w:val="22"/><w:szCs w:val="22"/></w:rPr><w:t xml:space="preserve">Aktor: Asprak</w:t></w:r></w:p><w:p><w:pPr><w:spacing w:after="60"/><w:numPr><w:ilvl w:val="0"/><w:numId w:val=""/></w:numPr></w:pPr><w:r><w:rPr><w:sz w:val="22"/><w:szCs w:val="22"/></w:rPr><w:t xml:space="preserve">Kondisi Prasyarat: Minimal ada dua mahasiswa yang sudah mengumpulkan tugas pada modul yang sama dengan format file PDF atau Word.</w:t></w:r></w:p><w:p><w:pPr><w:spacing w:after="60"/><w:numPr><w:ilvl w:val="0"/><w:numId w:val=""/></w:numPr></w:pPr><w:r><w:rPr><w:sz w:val="22"/><w:szCs w:val="22"/></w:rPr><w:t xml:space="preserve">Deskripsi: Asprak menjalankan modul deteksi plagiarisme untuk suatu modul tugas. Proses yang terjadi:</w:t></w:r></w:p><w:p><w:pPr><w:spacing w:after="60"/><w:numPr><w:ilvl w:val="0"/><w:numId w:val=""/></w:numPr></w:pPr><w:r><w:rPr><w:sz w:val="22"/><w:szCs w:val="22"/></w:rPr><w:t xml:space="preserve">Sistem mengekstrak teks dari seluruh dokumen PDF dan Word yang dikumpulkan.</w:t></w:r></w:p><w:p><w:pPr><w:spacing w:after="60"/><w:numPr><w:ilvl w:val="0"/><w:numId w:val=""/></w:numPr></w:pPr><w:r><w:rPr><w:sz w:val="22"/><w:szCs w:val="22"/></w:rPr><w:t xml:space="preserve">Teks dipecah menjadi pecahan-pecahan kecil (N-gram/trigram).</w:t></w:r></w:p><w:p><w:pPr><w:spacing w:after="60"/><w:numPr><w:ilvl w:val="0"/><w:numId w:val=""/></w:numPr></w:pPr><w:r><w:rPr><w:sz w:val="22"/><w:szCs w:val="22"/></w:rPr><w:t xml:space="preserve">Tingkat kemiripan antara setiap pasang dokumen dihitung menggunakan metode Intersection over Union.</w:t></w:r></w:p><w:p><w:pPr><w:spacing w:after="60"/><w:numPr><w:ilvl w:val="0"/><w:numId w:val=""/></w:numPr></w:pPr><w:r><w:rPr><w:sz w:val="22"/><w:szCs w:val="22"/></w:rPr><w:t xml:space="preserve">Laporan matriks kemiripan antar mahasiswa ditampilkan kepada Asprak.</w:t></w:r></w:p><w:p><w:pPr><w:spacing w:after="60"/><w:numPr><w:ilvl w:val="0"/><w:numId w:val=""/></w:numPr></w:pPr><w:r><w:rPr><w:sz w:val="22"/><w:szCs w:val="22"/></w:rPr><w:t xml:space="preserve">Aksi Lanjutan: Asprak dapat menerapkan Penalti Plagiarisme secara non-destruktif. Nilai asli tidak diubah; sistem menyimpan nilai penalti secara terpisah. Nilai Akhir = Nilai Asli − Total Penalti.</w:t></w:r></w:p><w:p/><w:p><w:pPr><w:spacing w:before="180" w:after="80"/></w:pPr><w:r><w:rPr><w:color w:val="1565c0"/><w:sz w:val="24"/><w:szCs w:val="24"/><w:b w:val="1"/><w:bCs w:val="1"/></w:rPr><w:t xml:space="preserve">UC-13: Penilaian Tugas Mahasiswa (Grading)</w:t></w:r></w:p><w:p><w:pPr><w:spacing w:after="60"/><w:numPr><w:ilvl w:val="0"/><w:numId w:val=""/></w:numPr></w:pPr><w:r><w:rPr><w:sz w:val="22"/><w:szCs w:val="22"/></w:rPr><w:t xml:space="preserve">Aktor: Asprak</w:t></w:r></w:p><w:p><w:pPr><w:spacing w:after="60"/><w:numPr><w:ilvl w:val="0"/><w:numId w:val=""/></w:numPr></w:pPr><w:r><w:rPr><w:sz w:val="22"/><w:szCs w:val="22"/></w:rPr><w:t xml:space="preserve">Kondisi Prasyarat: Mahasiswa sudah melakukan Final Submit (UC-10).</w:t></w:r></w:p><w:p><w:pPr><w:spacing w:after="60"/><w:numPr><w:ilvl w:val="0"/><w:numId w:val=""/></w:numPr></w:pPr><w:r><w:rPr><w:sz w:val="22"/><w:szCs w:val="22"/></w:rPr><w:t xml:space="preserve">Deskripsi: Asprak membuka detail pengumpulan tugas setiap mahasiswa, memberikan nilai numerik (0–100) dan catatan feedback naratif berbasis teks. Nilai dan feedback dapat diperbarui kembali oleh Asprak selama proses penilaian masih berlangsung.</w:t></w:r></w:p><w:p/><w:p><w:pPr/><w:r><w:pict><v:shape id="_x0000_s1144" type="#_x0000_t32" style="margin-left:0pt; margin-top:0pt; mso-position-horizontal:left; mso-position-vertical:top; mso-position-horizontal-relative:char; mso-position-vertical-relative:line;"><w10:wrap type="inline"/><v:stroke weight="1pt" color="cccccc"/></v:shape></w:pict></w:r></w:p><w:p/><w:p/><w:p><w:pPr><w:spacing w:before="240" w:after="60"/></w:pPr><w:r><w:rPr><w:color w:val="546e7a"/><w:sz w:val="22"/><w:szCs w:val="22"/><w:b w:val="1"/><w:bCs w:val="1"/><w:i w:val="1"/><w:iCs w:val="1"/></w:rPr><w:t xml:space="preserve">— FASE 7: PELAPORAN & EKSPOR —</w:t></w:r></w:p><w:p/><w:p><w:pPr><w:spacing w:before="180" w:after="80"/></w:pPr><w:r><w:rPr><w:color w:val="1565c0"/><w:sz w:val="24"/><w:szCs w:val="24"/><w:b w:val="1"/><w:bCs w:val="1"/></w:rPr><w:t xml:space="preserve">UC-14: Ekspor Rekap Nilai ke Berkas CSV</w:t></w:r></w:p><w:p><w:pPr><w:spacing w:after="60"/><w:numPr><w:ilvl w:val="0"/><w:numId w:val=""/></w:numPr></w:pPr><w:r><w:rPr><w:sz w:val="22"/><w:szCs w:val="22"/></w:rPr><w:t xml:space="preserve">Aktor: Asprak</w:t></w:r></w:p><w:p><w:pPr><w:spacing w:after="60"/><w:numPr><w:ilvl w:val="0"/><w:numId w:val=""/></w:numPr></w:pPr><w:r><w:rPr><w:sz w:val="22"/><w:szCs w:val="22"/></w:rPr><w:t xml:space="preserve">Deskripsi: Asprak mengunduh rekapitulasi nilai dalam format berkas .csv yang dapat dibuka dengan Microsoft Excel. Berkas menggunakan delimiter titik koma (;) dan penyandian UTF-8 agar kompatibel dengan pengaturan regional Indonesia. Terdapat dua mode ekspor:</w:t></w:r></w:p><w:p><w:pPr><w:spacing w:after="60"/><w:numPr><w:ilvl w:val="0"/><w:numId w:val=""/></w:numPr></w:pPr><w:r><w:rPr><w:sz w:val="22"/><w:szCs w:val="22"/></w:rPr><w:t xml:space="preserve">Per Tugas: Menampilkan detail nilai satu modul tugas, mencakup kolom: Nilai Asli, Potongan Plagiarisme, Potongan Keterlambatan, Nilai Akhir, dan Feedback Asisten.</w:t></w:r></w:p><w:p><w:pPr><w:spacing w:after="60"/><w:numPr><w:ilvl w:val="0"/><w:numId w:val=""/></w:numPr></w:pPr><w:r><w:rPr><w:sz w:val="22"/><w:szCs w:val="22"/></w:rPr><w:t xml:space="preserve">Rekapitulasi Kelas: Menampilkan semua mahasiswa dalam satu kelas dengan nilai setiap tugas dalam kolom terpisah; siap digunakan sebagai laporan nilai akhir semester.</w:t></w:r></w:p><w:p/><w:p><w:pPr/><w:r><w:pict><v:shape id="_x0000_s1155" type="#_x0000_t32" style="margin-left:0pt; margin-top:0pt; mso-position-horizontal:left; mso-position-vertical:top; mso-position-horizontal-relative:char; mso-position-vertical-relative:line;"><w10:wrap type="inline"/><v:stroke weight="1pt" color="cccccc"/></v:shape></w:pict></w:r></w:p><w:p/><w:p/><w:p><w:pPr><w:spacing w:before="200" w:after="120"/></w:pPr><w:r><w:rPr><w:color w:val="1a237e"/><w:sz w:val="28"/><w:szCs w:val="28"/><w:b w:val="1"/><w:bCs w:val="1"/></w:rPr><w:t xml:space="preserve">4. Kebutuhan Non-Fungsional (NFR)</w:t></w:r></w:p><w:p/><w:p/><w:p><w:pPr/><w:r><w:pict><v:shape id="_x0000_s1161" type="#_x0000_t32" style="margin-left:0pt; margin-top:0pt; mso-position-horizontal:left; mso-position-vertical:top; mso-position-horizontal-relative:char; mso-position-vertical-relative:line;"><w10:wrap type="inline"/><v:stroke weight="1pt" color="cccccc"/></v:shape></w:pict></w:r></w:p><w:p/><w:p/><w:p><w:pPr><w:spacing w:after="80"/></w:pPr><w:r><w:rPr><w:sz w:val="22"/><w:szCs w:val="22"/><w:i w:val="1"/><w:iCs w:val="1"/></w:rPr><w:t xml:space="preserve">Dokumen ini merepresentasikan use case sistem PrakCheck dalam kapasitas produksi dan siap digunakan sebagai referensi pembaruan SKPL resmi.</w:t></w:r><w:r><w:rPr><w:sz w:val="22"/><w:szCs w:val="22"/></w:rPr><w:t xml:space="preserve">Dokumen ini merepresentasikan use case sistem PrakCheck dalam kapasitas produksi dan siap digunakan sebagai referensi pembaruan SKPL resmi.</w:t></w:r></w:p><w:p/><w:sectPr><w:pgSz w:orient="portrait" w:w="11905.511811023622" w:h="16837.79527559055"/><w:pgMar w:top="1200" w:right="1440" w:bottom="1200" w:left="1440" w:header="720" w:footer="720" w:gutter="0"/><w:cols w:num="1" w:space="720"/></w:sectPr></w:body></w:document>
 </file>
 
 <file path=word/comments.xml><?xml version="1.0" encoding="utf-8"?>
@@ -8,159 +8,7 @@
 </file>
 
 <file path=word/numbering.xml><?xml version="1.0" encoding="utf-8"?>
-<w:numbering xmlns:ve="http://schemas.openxmlformats.org/markup-compatibility/2006" xmlns:o="urn:schemas-microsoft-com:office:office" xmlns:r="http://schemas.openxmlformats.org/officeDocument/2006/relationships" xmlns:m="http://schemas.openxmlformats.org/officeDocument/2006/math" xmlns:v="urn:schemas-microsoft-com:vml" xmlns:wp="http://schemas.openxmlformats.org/drawingml/2006/wordprocessingDrawing" xmlns:w10="urn:schemas-microsoft-com:office:word" xmlns:w="http://schemas.openxmlformats.org/wordprocessingml/2006/main" xmlns:wne="http://schemas.microsoft.com/office/word/2006/wordml">
-  <w:abstractNum w:abstractNumId="1">
-    <w:nsid w:val="C058793F"/>
-    <w:multiLevelType w:val="hybridMultilevel"/>
-    <w:lvl w:ilvl="0">
-      <w:start w:val="1"/>
-      <w:numFmt w:val="bullet"/>
-      <w:suff w:val="tab"/>
-      <w:lvlText w:val=""/>
-      <w:lvlJc w:val="left"/>
-      <w:pPr>
-        <w:tabs>
-          <w:tab w:val="num" w:pos="720"/>
-        </w:tabs>
-        <w:ind w:left="720" w:hanging="360"/>
-      </w:pPr>
-      <w:rPr>
-        <w:rFonts w:ascii="Symbol" w:hAnsi="Symbol" w:cs="Symbol" w:hint="default"/>
-      </w:rPr>
-    </w:lvl>
-    <w:lvl w:ilvl="1">
-      <w:start w:val="1"/>
-      <w:numFmt w:val="bullet"/>
-      <w:suff w:val="tab"/>
-      <w:lvlText w:val="o"/>
-      <w:lvlJc w:val="left"/>
-      <w:pPr>
-        <w:tabs>
-          <w:tab w:val="num" w:pos="1440"/>
-        </w:tabs>
-        <w:ind w:left="1440" w:hanging="360"/>
-      </w:pPr>
-      <w:rPr>
-        <w:rFonts w:ascii="Courier New" w:hAnsi="Courier New" w:cs="Courier New" w:hint="default"/>
-      </w:rPr>
-    </w:lvl>
-    <w:lvl w:ilvl="2">
-      <w:start w:val="1"/>
-      <w:numFmt w:val="bullet"/>
-      <w:suff w:val="tab"/>
-      <w:lvlText w:val=""/>
-      <w:lvlJc w:val="left"/>
-      <w:pPr>
-        <w:tabs>
-          <w:tab w:val="num" w:pos="2160"/>
-        </w:tabs>
-        <w:ind w:left="2160" w:hanging="360"/>
-      </w:pPr>
-      <w:rPr>
-        <w:rFonts w:ascii="Wingdings" w:hAnsi="Wingdings" w:cs="Wingdings" w:hint="default"/>
-      </w:rPr>
-    </w:lvl>
-    <w:lvl w:ilvl="3">
-      <w:start w:val="1"/>
-      <w:numFmt w:val="bullet"/>
-      <w:suff w:val="tab"/>
-      <w:lvlText w:val=""/>
-      <w:lvlJc w:val="left"/>
-      <w:pPr>
-        <w:tabs>
-          <w:tab w:val="num" w:pos="2880"/>
-        </w:tabs>
-        <w:ind w:left="2880" w:hanging="360"/>
-      </w:pPr>
-      <w:rPr>
-        <w:rFonts w:ascii="Symbol" w:hAnsi="Symbol" w:cs="Symbol" w:hint="default"/>
-      </w:rPr>
-    </w:lvl>
-    <w:lvl w:ilvl="4">
-      <w:start w:val="1"/>
-      <w:numFmt w:val="bullet"/>
-      <w:suff w:val="tab"/>
-      <w:lvlText w:val="o"/>
-      <w:lvlJc w:val="left"/>
-      <w:pPr>
-        <w:tabs>
-          <w:tab w:val="num" w:pos="3600"/>
-        </w:tabs>
-        <w:ind w:left="3600" w:hanging="360"/>
-      </w:pPr>
-      <w:rPr>
-        <w:rFonts w:ascii="Courier New" w:hAnsi="Courier New" w:cs="Courier New" w:hint="default"/>
-      </w:rPr>
-    </w:lvl>
-    <w:lvl w:ilvl="5">
-      <w:start w:val="1"/>
-      <w:numFmt w:val="bullet"/>
-      <w:suff w:val="tab"/>
-      <w:lvlText w:val=""/>
-      <w:lvlJc w:val="left"/>
-      <w:pPr>
-        <w:tabs>
-          <w:tab w:val="num" w:pos="4320"/>
-        </w:tabs>
-        <w:ind w:left="4320" w:hanging="360"/>
-      </w:pPr>
-      <w:rPr>
-        <w:rFonts w:ascii="Wingdings" w:hAnsi="Wingdings" w:cs="Wingdings" w:hint="default"/>
-      </w:rPr>
-    </w:lvl>
-    <w:lvl w:ilvl="6">
-      <w:start w:val="1"/>
-      <w:numFmt w:val="bullet"/>
-      <w:suff w:val="tab"/>
-      <w:lvlText w:val=""/>
-      <w:lvlJc w:val="left"/>
-      <w:pPr>
-        <w:tabs>
-          <w:tab w:val="num" w:pos="5040"/>
-        </w:tabs>
-        <w:ind w:left="5040" w:hanging="360"/>
-      </w:pPr>
-      <w:rPr>
-        <w:rFonts w:ascii="Symbol" w:hAnsi="Symbol" w:cs="Symbol" w:hint="default"/>
-      </w:rPr>
-    </w:lvl>
-    <w:lvl w:ilvl="7">
-      <w:start w:val="1"/>
-      <w:numFmt w:val="bullet"/>
-      <w:suff w:val="tab"/>
-      <w:lvlText w:val="o"/>
-      <w:lvlJc w:val="left"/>
-      <w:pPr>
-        <w:tabs>
-          <w:tab w:val="num" w:pos="5760"/>
-        </w:tabs>
-        <w:ind w:left="5760" w:hanging="360"/>
-      </w:pPr>
-      <w:rPr>
-        <w:rFonts w:ascii="Courier New" w:hAnsi="Courier New" w:cs="Courier New" w:hint="default"/>
-      </w:rPr>
-    </w:lvl>
-    <w:lvl w:ilvl="8">
-      <w:start w:val="1"/>
-      <w:numFmt w:val="bullet"/>
-      <w:suff w:val="tab"/>
-      <w:lvlText w:val=""/>
-      <w:lvlJc w:val="left"/>
-      <w:pPr>
-        <w:tabs>
-          <w:tab w:val="num" w:pos="6480"/>
-        </w:tabs>
-        <w:ind w:left="6480" w:hanging="360"/>
-      </w:pPr>
-      <w:rPr>
-        <w:rFonts w:ascii="Wingdings" w:hAnsi="Wingdings" w:cs="Wingdings" w:hint="default"/>
-      </w:rPr>
-    </w:lvl>
-  </w:abstractNum>
-  <w:num w:numId="1">
-    <w:abstractNumId w:val="1"/>
-  </w:num>
-</w:numbering>
+<w:numbering xmlns:ve="http://schemas.openxmlformats.org/markup-compatibility/2006" xmlns:o="urn:schemas-microsoft-com:office:office" xmlns:r="http://schemas.openxmlformats.org/officeDocument/2006/relationships" xmlns:m="http://schemas.openxmlformats.org/officeDocument/2006/math" xmlns:v="urn:schemas-microsoft-com:vml" xmlns:wp="http://schemas.openxmlformats.org/drawingml/2006/wordprocessingDrawing" xmlns:w10="urn:schemas-microsoft-com:office:word" xmlns:w="http://schemas.openxmlformats.org/wordprocessingml/2006/main" xmlns:wne="http://schemas.microsoft.com/office/word/2006/wordml"/>
 </file>
 
 <file path=word/styles.xml><?xml version="1.0" encoding="utf-8"?>
@@ -168,9 +16,9 @@
   <w:docDefaults>
     <w:rPrDefault>
       <w:rPr>
-        <w:rFonts w:ascii="Arial" w:hAnsi="Arial" w:eastAsia="Arial" w:cs="Arial"/>
-        <w:sz w:val="20"/>
-        <w:szCs w:val="20"/>
+        <w:rFonts w:ascii="Times New Roman" w:hAnsi="Times New Roman" w:eastAsia="Times New Roman" w:cs="Times New Roman"/>
+        <w:sz w:val="24"/>
+        <w:szCs w:val="24"/>
         <w:lang w:val="en-US"/>
       </w:rPr>
     </w:rPrDefault>

</xml_diff>